<commit_message>
Add real LoRA reward-model experiment and modern literature
</commit_message>
<xml_diff>
--- a/article/SUMMA2026_RU_gradient_geometry.docx
+++ b/article/SUMMA2026_RU_gradient_geometry.docx
@@ -11,7 +11,7 @@
           <w:rFonts w:ascii="Times New Roman" w:hAnsi="Times New Roman" w:eastAsia="Times New Roman"/>
           <w:sz w:val="48"/>
         </w:rPr>
-        <w:t>Геометрия градиента и выбор логистической потери при обучении по предпочтениям</w:t>
+        <w:t>Геометрия градиента и LoRA-адаптация при обучении по предпочтениям</w:t>
       </w:r>
     </w:p>
     <w:p>
@@ -100,7 +100,7 @@
           <w:i w:val="0"/>
           <w:sz w:val="18"/>
         </w:rPr>
-        <w:t>Исследуется влияние температурного параметра β на геометрию пакетного градиента и на различия между парной и поэлементной логистическими потерями. Эксперимент выполнен на 2000 реальных парах человеческих предпочтений Anthropic HH-RLHF. Ответы представлены детерминированными хешированными униграммами и биграммами размерности 4096; использованы разбиение 1400/300/300, пять инициализаций и одинаковый бюджет оптимизации. При изменении β от 0,1 до 10 угол пакетного градиента относительно β=1 достиг 34,71°, нормированный эффективный размер выборки уменьшился с 0,9998 до 0,7141, а доля насыщенных весов выросла до 0,2167. Максимальная тестовая точность парной модели составила 0,5627±0,0072 при β=0,3; для поэлементной модели — 0,5433±0,0129. Результаты подтверждают, что β меняет не только длину шага, но и направление обновления, а выбор функции потерь взаимодействует с температурой. Эксперимент является диагностикой механизма на реальных предпочтениях и не заменяет полноразмерное дообучение языковой модели.</w:t>
+        <w:t>Исследуется влияние температурного параметра β на геометрию пакетного градиента и низкоранговую адаптацию reward-модели. Эксперимент выполнен на 2000 реальных парах Anthropic HH-RLHF. В линейной постановке при изменении β от 0,1 до 10 угол градиента достиг 34,71°, а ESS/n уменьшился до 0,7141; максимальная точность парной модели составила 0,5627±0,0072 при β=0,3. Дополнительно предобученный BERT-tiny адаптирован методом LoRA ранга 8: обучались 8321 из 4394241 параметров (0,189%). По трём инициализациям LoRA получила точность 0,5333±0,0200 против 0,5467±0,0058 у замороженного энкодера с обучаемой головой, то есть прирост качества на малой выборке не подтверждён. При этом в пространстве LoRA-параметров β=10 повернул градиент на 30,39°, снизил ESS/n до 0,6199 и насытил 31,25% весов. Результаты подтверждают геометрический механизм в нейросетевой модели и показывают необходимость ранней остановки и нескольких seed.</w:t>
       </w:r>
     </w:p>
     <w:p>
@@ -124,7 +124,7 @@
           <w:i/>
           <w:sz w:val="18"/>
         </w:rPr>
-        <w:t>прямая оптимизация предпочтений; геометрия градиента; парная потеря; поэлементная потеря; температурное масштабирование; HH-RLHF</w:t>
+        <w:t>оптимизация предпочтений; геометрия градиента; LoRA; reward-модель; температурное масштабирование; HH-RLHF</w:t>
       </w:r>
     </w:p>
     <w:p>
@@ -178,6 +178,19 @@
           <w:sz w:val="20"/>
         </w:rPr>
         <w:t>Цель работы — проверить оба эффекта на реальных данных человеческих предпочтений в полностью воспроизводимой постановке. В отличие от синтетических проверок исходных статей, здесь используется выборка HH-RLHF, публикуются все конфигурации, результаты отдельных запусков, контрольные суммы и тесты производных. Основные вопросы: насколько β поворачивает пакетный градиент; как меняется концентрация весов; различаются ли парная и поэлементная потери при одинаковом представлении и бюджете оптимизации.</w:t>
+      </w:r>
+    </w:p>
+    <w:p>
+      <w:pPr>
+        <w:pStyle w:val="a3"/>
+        <w:keepLines w:val="0"/>
+      </w:pPr>
+      <w:r>
+        <w:rPr>
+          <w:rFonts w:ascii="Times New Roman" w:hAnsi="Times New Roman" w:eastAsia="Times New Roman"/>
+          <w:sz w:val="20"/>
+        </w:rPr>
+        <w:t>Параметрически эффективное обучение дополняет эту постановку. LoRA ограничивает обновление весовой матрицы низкоранговым подпространством [13], QLoRA сочетает его с квантизацией [14], а LoRA+, DoRA и PiSSA уточняют скорости обучения, разложение веса и инициализацию адаптера [15]–[17]. Современная оценка reward-моделей показывает необходимость внешних и устойчивых проверок [18], а SePO переносит предпочтительный сигнал на информативные токены [19]. Поэтому второй эксперимент проверяет нашу геометрическую гипотезу непосредственно в пространстве LoRA-параметров.</w:t>
       </w:r>
     </w:p>
     <w:p>
@@ -605,6 +618,113 @@
           <w:i/>
           <w:sz w:val="20"/>
         </w:rPr>
+        <w:t>Трансформер и LoRA</w:t>
+      </w:r>
+    </w:p>
+    <w:p>
+      <w:pPr>
+        <w:pStyle w:val="a3"/>
+        <w:keepLines w:val="0"/>
+      </w:pPr>
+      <w:r>
+        <w:rPr>
+          <w:rFonts w:ascii="Times New Roman" w:hAnsi="Times New Roman" w:eastAsia="Times New Roman"/>
+          <w:sz w:val="20"/>
+        </w:rPr>
+        <w:t>Во втором эксперименте использован предобученный англоязычный BERT-tiny с двумя Transformer-слоями и скрытой размерностью 128. Тексты усекались слева до 192 токенов, чтобы сохранять конец ответа. Скалярная reward-голова применялась к представлению токена [CLS]. Контрольная модель обучала только голову; в LoRA-модели дополнительно обучались матрицы query и value всех attention-слоёв. Для исходной матрицы W низкоранговое обновление задавалось как</w:t>
+      </w:r>
+    </w:p>
+    <w:tbl>
+      <w:tblPr>
+        <w:tblW w:type="auto" w:w="0"/>
+        <w:jc w:val="center"/>
+        <w:tblLayout w:type="fixed"/>
+        <w:tblLook w:firstColumn="1" w:firstRow="1" w:lastColumn="0" w:lastRow="0" w:noHBand="0" w:noVBand="1" w:val="04A0"/>
+      </w:tblPr>
+      <w:tblGrid>
+        <w:gridCol w:w="5061"/>
+        <w:gridCol w:w="5061"/>
+      </w:tblGrid>
+      <w:tr>
+        <w:tc>
+          <w:tcPr>
+            <w:tcW w:type="dxa" w:w="4300"/>
+            <w:vAlign w:val="center"/>
+            <w:tcBorders>
+              <w:top w:val="nil"/>
+              <w:left w:val="nil"/>
+              <w:bottom w:val="nil"/>
+              <w:right w:val="nil"/>
+              <w:insideH w:val="nil"/>
+              <w:insideV w:val="nil"/>
+            </w:tcBorders>
+          </w:tcPr>
+          <w:p>
+            <w:pPr>
+              <w:pStyle w:val="equation"/>
+              <w:jc w:val="center"/>
+            </w:pPr>
+            <m:oMathPara>
+              <m:oMath>
+                <m:r>
+                  <m:t>W′=W+(α/r)BA,   rank(BA)≤r.</m:t>
+                </m:r>
+              </m:oMath>
+            </m:oMathPara>
+          </w:p>
+        </w:tc>
+        <w:tc>
+          <w:tcPr>
+            <w:tcW w:type="dxa" w:w="500"/>
+            <w:vAlign w:val="center"/>
+            <w:tcBorders>
+              <w:top w:val="nil"/>
+              <w:left w:val="nil"/>
+              <w:bottom w:val="nil"/>
+              <w:right w:val="nil"/>
+              <w:insideH w:val="nil"/>
+              <w:insideV w:val="nil"/>
+            </w:tcBorders>
+          </w:tcPr>
+          <w:p>
+            <w:pPr>
+              <w:jc w:val="right"/>
+            </w:pPr>
+            <w:r>
+              <w:rPr>
+                <w:rFonts w:ascii="Times New Roman" w:hAnsi="Times New Roman" w:eastAsia="Times New Roman"/>
+                <w:sz w:val="20"/>
+              </w:rPr>
+              <w:t>(5)</w:t>
+            </w:r>
+          </w:p>
+        </w:tc>
+      </w:tr>
+    </w:tbl>
+    <w:p>
+      <w:pPr>
+        <w:pStyle w:val="a3"/>
+        <w:keepLines w:val="0"/>
+      </w:pPr>
+      <w:r>
+        <w:rPr>
+          <w:rFonts w:ascii="Times New Roman" w:hAnsi="Times New Roman" w:eastAsia="Times New Roman"/>
+          <w:sz w:val="20"/>
+        </w:rPr>
+        <w:t>Использованы r=8, α=16, dropout 0,05, β=0,3, AdamW, learning rate 5·10⁻⁴ для адаптеров и 10⁻³ для головы, weight decay 0,01, batch size 16 и seeds 11, 29, 47. Выполнялись четыре эпохи; checkpoint выбирался исключительно по минимальной валидационной парной потере. Тестовая часть применялась один раз после выбора. В LoRA обучались 8321 из 4394241 параметров. Для лучшего по validation loss запуска градиенты всех обучаемых параметров вычислялись на фиксированном пакете из 64 валидационных пар при пяти значениях β.</w:t>
+      </w:r>
+    </w:p>
+    <w:p>
+      <w:pPr>
+        <w:pStyle w:val="2"/>
+        <w:keepNext/>
+      </w:pPr>
+      <w:r>
+        <w:rPr>
+          <w:rFonts w:ascii="Times New Roman" w:hAnsi="Times New Roman" w:eastAsia="Times New Roman"/>
+          <w:i/>
+          <w:sz w:val="20"/>
+        </w:rPr>
         <w:t>Проверки и метрики</w:t>
       </w:r>
     </w:p>
@@ -633,6 +753,14 @@
           <w:sz w:val="20"/>
         </w:rPr>
         <w:t>РЕЗУЛЬТАТЫ</w:t>
+      </w:r>
+    </w:p>
+    <w:p>
+      <w:pPr>
+        <w:spacing w:after="0"/>
+      </w:pPr>
+      <w:r>
+        <w:br w:type="column"/>
       </w:r>
     </w:p>
     <w:p>
@@ -670,6 +798,9 @@
         <w:gridCol w:w="1550"/>
       </w:tblGrid>
       <w:tr>
+        <w:trPr>
+          <w:tblHeader w:val="true"/>
+        </w:trPr>
         <w:tc>
           <w:tcPr>
             <w:tcW w:type="dxa" w:w="650"/>
@@ -1312,7 +1443,7 @@
         <w:drawing>
           <wp:inline xmlns:a="http://schemas.openxmlformats.org/drawingml/2006/main" xmlns:pic="http://schemas.openxmlformats.org/drawingml/2006/picture">
             <wp:extent cx="2971800" cy="1671638"/>
-            <wp:docPr id="1" name="Picture 1"/>
+            <wp:docPr id="1" name="Picture 1" descr="Два графика зависимости угла градиента и нормированного эффективного размера выборки от beta" title="Геометрия пакетного градиента на HH-RLHF"/>
             <wp:cNvGraphicFramePr>
               <a:graphicFrameLocks noChangeAspect="1"/>
             </wp:cNvGraphicFramePr>
@@ -1400,6 +1531,9 @@
         <w:gridCol w:w="900"/>
       </w:tblGrid>
       <w:tr>
+        <w:trPr>
+          <w:tblHeader w:val="true"/>
+        </w:trPr>
         <w:tc>
           <w:tcPr>
             <w:tcW w:type="dxa" w:w="1100"/>
@@ -2831,6 +2965,1134 @@
           <w:sz w:val="20"/>
         </w:rPr>
         <w:t>Вероятностная калибровка во всех режимах остаётся слабой: минимальный Brier score равен 0,2484 для парной модели и 0,2492 для поэлементной. Это ожидаемо для компактного линейного скорера и подчёркивает, что ranking accuracy и уверенность следует анализировать раздельно.</w:t>
+      </w:r>
+    </w:p>
+    <w:p>
+      <w:pPr>
+        <w:pStyle w:val="1"/>
+        <w:keepNext/>
+      </w:pPr>
+      <w:r>
+        <w:rPr>
+          <w:rFonts w:ascii="Times New Roman" w:hAnsi="Times New Roman" w:eastAsia="Times New Roman"/>
+          <w:i w:val="0"/>
+          <w:sz w:val="20"/>
+        </w:rPr>
+        <w:t>РЕЗУЛЬТАТЫ LORA-АДАПТАЦИИ</w:t>
+      </w:r>
+    </w:p>
+    <w:p>
+      <w:pPr>
+        <w:pStyle w:val="tablehead"/>
+        <w:keepNext/>
+      </w:pPr>
+      <w:r>
+        <w:rPr>
+          <w:rFonts w:ascii="Times New Roman" w:hAnsi="Times New Roman" w:eastAsia="Times New Roman"/>
+          <w:sz w:val="16"/>
+        </w:rPr>
+        <w:t>СРАВНЕНИЕ ТРАНСФОРМЕРНЫХ REWARD-МОДЕЛЕЙ</w:t>
+      </w:r>
+    </w:p>
+    <w:tbl>
+      <w:tblPr>
+        <w:tblW w:type="auto" w:w="0"/>
+        <w:jc w:val="center"/>
+        <w:tblLayout w:type="fixed"/>
+        <w:tblLook w:firstColumn="1" w:firstRow="1" w:lastColumn="0" w:lastRow="0" w:noHBand="0" w:noVBand="1" w:val="04A0"/>
+        <w:tblBorders>
+          <w:top w:val="single" w:sz="4" w:color="A6A6A6"/>
+          <w:left w:val="single" w:sz="4" w:color="A6A6A6"/>
+          <w:bottom w:val="single" w:sz="4" w:color="A6A6A6"/>
+          <w:right w:val="single" w:sz="4" w:color="A6A6A6"/>
+          <w:insideH w:val="single" w:sz="4" w:color="A6A6A6"/>
+          <w:insideV w:val="single" w:sz="4" w:color="A6A6A6"/>
+        </w:tblBorders>
+      </w:tblPr>
+      <w:tblGrid>
+        <w:gridCol w:w="1150"/>
+        <w:gridCol w:w="1000"/>
+        <w:gridCol w:w="800"/>
+        <w:gridCol w:w="1450"/>
+        <w:gridCol w:w="900"/>
+      </w:tblGrid>
+      <w:tr>
+        <w:trPr>
+          <w:tblHeader w:val="true"/>
+        </w:trPr>
+        <w:tc>
+          <w:tcPr>
+            <w:tcW w:type="dxa" w:w="1150"/>
+            <w:shd w:fill="D9E2F3"/>
+            <w:vAlign w:val="center"/>
+            <w:tcMar>
+              <w:top w:w="50" w:type="dxa"/>
+              <w:start w:w="50" w:type="dxa"/>
+              <w:bottom w:w="50" w:type="dxa"/>
+              <w:end w:w="50" w:type="dxa"/>
+            </w:tcMar>
+          </w:tcPr>
+          <w:p>
+            <w:pPr>
+              <w:spacing w:after="0"/>
+              <w:jc w:val="center"/>
+            </w:pPr>
+            <w:r>
+              <w:rPr>
+                <w:rFonts w:ascii="Times New Roman" w:hAnsi="Times New Roman" w:eastAsia="Times New Roman"/>
+                <w:b/>
+                <w:sz w:val="15"/>
+              </w:rPr>
+              <w:t>Метод</w:t>
+            </w:r>
+          </w:p>
+        </w:tc>
+        <w:tc>
+          <w:tcPr>
+            <w:tcW w:type="dxa" w:w="1000"/>
+            <w:shd w:fill="D9E2F3"/>
+            <w:vAlign w:val="center"/>
+            <w:tcMar>
+              <w:top w:w="50" w:type="dxa"/>
+              <w:start w:w="50" w:type="dxa"/>
+              <w:bottom w:w="50" w:type="dxa"/>
+              <w:end w:w="50" w:type="dxa"/>
+            </w:tcMar>
+          </w:tcPr>
+          <w:p>
+            <w:pPr>
+              <w:spacing w:after="0"/>
+              <w:jc w:val="center"/>
+            </w:pPr>
+            <w:r>
+              <w:rPr>
+                <w:rFonts w:ascii="Times New Roman" w:hAnsi="Times New Roman" w:eastAsia="Times New Roman"/>
+                <w:b/>
+                <w:sz w:val="15"/>
+              </w:rPr>
+              <w:t>Обуч. парам.</w:t>
+            </w:r>
+          </w:p>
+        </w:tc>
+        <w:tc>
+          <w:tcPr>
+            <w:tcW w:type="dxa" w:w="800"/>
+            <w:shd w:fill="D9E2F3"/>
+            <w:vAlign w:val="center"/>
+            <w:tcMar>
+              <w:top w:w="50" w:type="dxa"/>
+              <w:start w:w="50" w:type="dxa"/>
+              <w:bottom w:w="50" w:type="dxa"/>
+              <w:end w:w="50" w:type="dxa"/>
+            </w:tcMar>
+          </w:tcPr>
+          <w:p>
+            <w:pPr>
+              <w:spacing w:after="0"/>
+              <w:jc w:val="center"/>
+            </w:pPr>
+            <w:r>
+              <w:rPr>
+                <w:rFonts w:ascii="Times New Roman" w:hAnsi="Times New Roman" w:eastAsia="Times New Roman"/>
+                <w:b/>
+                <w:sz w:val="15"/>
+              </w:rPr>
+              <w:t>Доля, %</w:t>
+            </w:r>
+          </w:p>
+        </w:tc>
+        <w:tc>
+          <w:tcPr>
+            <w:tcW w:type="dxa" w:w="1450"/>
+            <w:shd w:fill="D9E2F3"/>
+            <w:vAlign w:val="center"/>
+            <w:tcMar>
+              <w:top w:w="50" w:type="dxa"/>
+              <w:start w:w="50" w:type="dxa"/>
+              <w:bottom w:w="50" w:type="dxa"/>
+              <w:end w:w="50" w:type="dxa"/>
+            </w:tcMar>
+          </w:tcPr>
+          <w:p>
+            <w:pPr>
+              <w:spacing w:after="0"/>
+              <w:jc w:val="center"/>
+            </w:pPr>
+            <w:r>
+              <w:rPr>
+                <w:rFonts w:ascii="Times New Roman" w:hAnsi="Times New Roman" w:eastAsia="Times New Roman"/>
+                <w:b/>
+                <w:sz w:val="15"/>
+              </w:rPr>
+              <w:t>Точность</w:t>
+            </w:r>
+          </w:p>
+        </w:tc>
+        <w:tc>
+          <w:tcPr>
+            <w:tcW w:type="dxa" w:w="900"/>
+            <w:shd w:fill="D9E2F3"/>
+            <w:vAlign w:val="center"/>
+            <w:tcMar>
+              <w:top w:w="50" w:type="dxa"/>
+              <w:start w:w="50" w:type="dxa"/>
+              <w:bottom w:w="50" w:type="dxa"/>
+              <w:end w:w="50" w:type="dxa"/>
+            </w:tcMar>
+          </w:tcPr>
+          <w:p>
+            <w:pPr>
+              <w:spacing w:after="0"/>
+              <w:jc w:val="center"/>
+            </w:pPr>
+            <w:r>
+              <w:rPr>
+                <w:rFonts w:ascii="Times New Roman" w:hAnsi="Times New Roman" w:eastAsia="Times New Roman"/>
+                <w:b/>
+                <w:sz w:val="15"/>
+              </w:rPr>
+              <w:t>Log loss</w:t>
+            </w:r>
+          </w:p>
+        </w:tc>
+      </w:tr>
+      <w:tr>
+        <w:tc>
+          <w:tcPr>
+            <w:tcW w:type="dxa" w:w="1150"/>
+            <w:vAlign w:val="center"/>
+            <w:tcMar>
+              <w:top w:w="50" w:type="dxa"/>
+              <w:start w:w="50" w:type="dxa"/>
+              <w:bottom w:w="50" w:type="dxa"/>
+              <w:end w:w="50" w:type="dxa"/>
+            </w:tcMar>
+          </w:tcPr>
+          <w:p>
+            <w:pPr>
+              <w:spacing w:after="0" w:line="216" w:lineRule="auto"/>
+              <w:jc w:val="center"/>
+            </w:pPr>
+            <w:r>
+              <w:rPr>
+                <w:rFonts w:ascii="Times New Roman" w:hAnsi="Times New Roman" w:eastAsia="Times New Roman"/>
+                <w:sz w:val="15"/>
+              </w:rPr>
+              <w:t>только head</w:t>
+            </w:r>
+          </w:p>
+        </w:tc>
+        <w:tc>
+          <w:tcPr>
+            <w:tcW w:type="dxa" w:w="1000"/>
+            <w:vAlign w:val="center"/>
+            <w:tcMar>
+              <w:top w:w="50" w:type="dxa"/>
+              <w:start w:w="50" w:type="dxa"/>
+              <w:bottom w:w="50" w:type="dxa"/>
+              <w:end w:w="50" w:type="dxa"/>
+            </w:tcMar>
+          </w:tcPr>
+          <w:p>
+            <w:pPr>
+              <w:spacing w:after="0" w:line="216" w:lineRule="auto"/>
+              <w:jc w:val="center"/>
+            </w:pPr>
+            <w:r>
+              <w:rPr>
+                <w:rFonts w:ascii="Times New Roman" w:hAnsi="Times New Roman" w:eastAsia="Times New Roman"/>
+                <w:sz w:val="15"/>
+              </w:rPr>
+              <w:t>129</w:t>
+            </w:r>
+          </w:p>
+        </w:tc>
+        <w:tc>
+          <w:tcPr>
+            <w:tcW w:type="dxa" w:w="800"/>
+            <w:vAlign w:val="center"/>
+            <w:tcMar>
+              <w:top w:w="50" w:type="dxa"/>
+              <w:start w:w="50" w:type="dxa"/>
+              <w:bottom w:w="50" w:type="dxa"/>
+              <w:end w:w="50" w:type="dxa"/>
+            </w:tcMar>
+          </w:tcPr>
+          <w:p>
+            <w:pPr>
+              <w:spacing w:after="0" w:line="216" w:lineRule="auto"/>
+              <w:jc w:val="center"/>
+            </w:pPr>
+            <w:r>
+              <w:rPr>
+                <w:rFonts w:ascii="Times New Roman" w:hAnsi="Times New Roman" w:eastAsia="Times New Roman"/>
+                <w:sz w:val="15"/>
+              </w:rPr>
+              <w:t>0.003</w:t>
+            </w:r>
+          </w:p>
+        </w:tc>
+        <w:tc>
+          <w:tcPr>
+            <w:tcW w:type="dxa" w:w="1450"/>
+            <w:vAlign w:val="center"/>
+            <w:tcMar>
+              <w:top w:w="50" w:type="dxa"/>
+              <w:start w:w="50" w:type="dxa"/>
+              <w:bottom w:w="50" w:type="dxa"/>
+              <w:end w:w="50" w:type="dxa"/>
+            </w:tcMar>
+          </w:tcPr>
+          <w:p>
+            <w:pPr>
+              <w:spacing w:after="0" w:line="216" w:lineRule="auto"/>
+              <w:jc w:val="center"/>
+            </w:pPr>
+            <w:r>
+              <w:rPr>
+                <w:rFonts w:ascii="Times New Roman" w:hAnsi="Times New Roman" w:eastAsia="Times New Roman"/>
+                <w:sz w:val="15"/>
+              </w:rPr>
+              <w:t>0.547±0.006</w:t>
+            </w:r>
+          </w:p>
+        </w:tc>
+        <w:tc>
+          <w:tcPr>
+            <w:tcW w:type="dxa" w:w="900"/>
+            <w:vAlign w:val="center"/>
+            <w:tcMar>
+              <w:top w:w="50" w:type="dxa"/>
+              <w:start w:w="50" w:type="dxa"/>
+              <w:bottom w:w="50" w:type="dxa"/>
+              <w:end w:w="50" w:type="dxa"/>
+            </w:tcMar>
+          </w:tcPr>
+          <w:p>
+            <w:pPr>
+              <w:spacing w:after="0" w:line="216" w:lineRule="auto"/>
+              <w:jc w:val="center"/>
+            </w:pPr>
+            <w:r>
+              <w:rPr>
+                <w:rFonts w:ascii="Times New Roman" w:hAnsi="Times New Roman" w:eastAsia="Times New Roman"/>
+                <w:sz w:val="15"/>
+              </w:rPr>
+              <w:t>0.686</w:t>
+            </w:r>
+          </w:p>
+        </w:tc>
+      </w:tr>
+      <w:tr>
+        <w:tc>
+          <w:tcPr>
+            <w:tcW w:type="dxa" w:w="1150"/>
+            <w:vAlign w:val="center"/>
+            <w:tcMar>
+              <w:top w:w="50" w:type="dxa"/>
+              <w:start w:w="50" w:type="dxa"/>
+              <w:bottom w:w="50" w:type="dxa"/>
+              <w:end w:w="50" w:type="dxa"/>
+            </w:tcMar>
+          </w:tcPr>
+          <w:p>
+            <w:pPr>
+              <w:spacing w:after="0" w:line="216" w:lineRule="auto"/>
+              <w:jc w:val="center"/>
+            </w:pPr>
+            <w:r>
+              <w:rPr>
+                <w:rFonts w:ascii="Times New Roman" w:hAnsi="Times New Roman" w:eastAsia="Times New Roman"/>
+                <w:sz w:val="15"/>
+              </w:rPr>
+              <w:t>LoRA r=8</w:t>
+            </w:r>
+          </w:p>
+        </w:tc>
+        <w:tc>
+          <w:tcPr>
+            <w:tcW w:type="dxa" w:w="1000"/>
+            <w:vAlign w:val="center"/>
+            <w:tcMar>
+              <w:top w:w="50" w:type="dxa"/>
+              <w:start w:w="50" w:type="dxa"/>
+              <w:bottom w:w="50" w:type="dxa"/>
+              <w:end w:w="50" w:type="dxa"/>
+            </w:tcMar>
+          </w:tcPr>
+          <w:p>
+            <w:pPr>
+              <w:spacing w:after="0" w:line="216" w:lineRule="auto"/>
+              <w:jc w:val="center"/>
+            </w:pPr>
+            <w:r>
+              <w:rPr>
+                <w:rFonts w:ascii="Times New Roman" w:hAnsi="Times New Roman" w:eastAsia="Times New Roman"/>
+                <w:sz w:val="15"/>
+              </w:rPr>
+              <w:t>8321</w:t>
+            </w:r>
+          </w:p>
+        </w:tc>
+        <w:tc>
+          <w:tcPr>
+            <w:tcW w:type="dxa" w:w="800"/>
+            <w:vAlign w:val="center"/>
+            <w:tcMar>
+              <w:top w:w="50" w:type="dxa"/>
+              <w:start w:w="50" w:type="dxa"/>
+              <w:bottom w:w="50" w:type="dxa"/>
+              <w:end w:w="50" w:type="dxa"/>
+            </w:tcMar>
+          </w:tcPr>
+          <w:p>
+            <w:pPr>
+              <w:spacing w:after="0" w:line="216" w:lineRule="auto"/>
+              <w:jc w:val="center"/>
+            </w:pPr>
+            <w:r>
+              <w:rPr>
+                <w:rFonts w:ascii="Times New Roman" w:hAnsi="Times New Roman" w:eastAsia="Times New Roman"/>
+                <w:sz w:val="15"/>
+              </w:rPr>
+              <w:t>0.189</w:t>
+            </w:r>
+          </w:p>
+        </w:tc>
+        <w:tc>
+          <w:tcPr>
+            <w:tcW w:type="dxa" w:w="1450"/>
+            <w:vAlign w:val="center"/>
+            <w:tcMar>
+              <w:top w:w="50" w:type="dxa"/>
+              <w:start w:w="50" w:type="dxa"/>
+              <w:bottom w:w="50" w:type="dxa"/>
+              <w:end w:w="50" w:type="dxa"/>
+            </w:tcMar>
+          </w:tcPr>
+          <w:p>
+            <w:pPr>
+              <w:spacing w:after="0" w:line="216" w:lineRule="auto"/>
+              <w:jc w:val="center"/>
+            </w:pPr>
+            <w:r>
+              <w:rPr>
+                <w:rFonts w:ascii="Times New Roman" w:hAnsi="Times New Roman" w:eastAsia="Times New Roman"/>
+                <w:sz w:val="15"/>
+              </w:rPr>
+              <w:t>0.533±0.020</w:t>
+            </w:r>
+          </w:p>
+        </w:tc>
+        <w:tc>
+          <w:tcPr>
+            <w:tcW w:type="dxa" w:w="900"/>
+            <w:vAlign w:val="center"/>
+            <w:tcMar>
+              <w:top w:w="50" w:type="dxa"/>
+              <w:start w:w="50" w:type="dxa"/>
+              <w:bottom w:w="50" w:type="dxa"/>
+              <w:end w:w="50" w:type="dxa"/>
+            </w:tcMar>
+          </w:tcPr>
+          <w:p>
+            <w:pPr>
+              <w:spacing w:after="0" w:line="216" w:lineRule="auto"/>
+              <w:jc w:val="center"/>
+            </w:pPr>
+            <w:r>
+              <w:rPr>
+                <w:rFonts w:ascii="Times New Roman" w:hAnsi="Times New Roman" w:eastAsia="Times New Roman"/>
+                <w:sz w:val="15"/>
+              </w:rPr>
+              <w:t>0.687</w:t>
+            </w:r>
+          </w:p>
+        </w:tc>
+      </w:tr>
+    </w:tbl>
+    <w:p>
+      <w:pPr>
+        <w:pStyle w:val="a3"/>
+        <w:keepLines w:val="0"/>
+      </w:pPr>
+      <w:r>
+        <w:rPr>
+          <w:rFonts w:ascii="Times New Roman" w:hAnsi="Times New Roman" w:eastAsia="Times New Roman"/>
+          <w:sz w:val="20"/>
+        </w:rPr>
+        <w:t>LoRA не повысила среднюю ranking accuracy: 0,5333±0,0200 против 0,5467±0,0058 у контроля. Средняя парная потеря также практически совпала: 0,6872 и 0,6865. Все три LoRA-запуска выбрали первую эпоху по validation loss, тогда как контроль в среднем выбрал эпоху 1,67. Это свидетельствует о раннем переобучении адаптера и не позволяет заявлять преимущество LoRA на 1400 обучающих парах. Отдельный лучший LoRA-seed достиг 0,5533, но единичный результат не использовался как основной вывод.</w:t>
+      </w:r>
+    </w:p>
+    <w:p>
+      <w:pPr>
+        <w:pStyle w:val="tablehead"/>
+        <w:keepNext/>
+      </w:pPr>
+      <w:r>
+        <w:rPr>
+          <w:rFonts w:ascii="Times New Roman" w:hAnsi="Times New Roman" w:eastAsia="Times New Roman"/>
+          <w:sz w:val="16"/>
+        </w:rPr>
+        <w:t>ГЕОМЕТРИЯ ГРАДИЕНТА В ПРОСТРАНСТВЕ LORA</w:t>
+      </w:r>
+    </w:p>
+    <w:tbl>
+      <w:tblPr>
+        <w:tblW w:type="auto" w:w="0"/>
+        <w:jc w:val="center"/>
+        <w:tblLayout w:type="fixed"/>
+        <w:tblLook w:firstColumn="1" w:firstRow="1" w:lastColumn="0" w:lastRow="0" w:noHBand="0" w:noVBand="1" w:val="04A0"/>
+        <w:tblBorders>
+          <w:top w:val="single" w:sz="4" w:color="A6A6A6"/>
+          <w:left w:val="single" w:sz="4" w:color="A6A6A6"/>
+          <w:bottom w:val="single" w:sz="4" w:color="A6A6A6"/>
+          <w:right w:val="single" w:sz="4" w:color="A6A6A6"/>
+          <w:insideH w:val="single" w:sz="4" w:color="A6A6A6"/>
+          <w:insideV w:val="single" w:sz="4" w:color="A6A6A6"/>
+        </w:tblBorders>
+      </w:tblPr>
+      <w:tblGrid>
+        <w:gridCol w:w="650"/>
+        <w:gridCol w:w="1300"/>
+        <w:gridCol w:w="1300"/>
+        <w:gridCol w:w="1550"/>
+      </w:tblGrid>
+      <w:tr>
+        <w:trPr>
+          <w:tblHeader w:val="true"/>
+        </w:trPr>
+        <w:tc>
+          <w:tcPr>
+            <w:tcW w:type="dxa" w:w="650"/>
+            <w:shd w:fill="D9E2F3"/>
+            <w:vAlign w:val="center"/>
+            <w:tcMar>
+              <w:top w:w="50" w:type="dxa"/>
+              <w:start w:w="50" w:type="dxa"/>
+              <w:bottom w:w="50" w:type="dxa"/>
+              <w:end w:w="50" w:type="dxa"/>
+            </w:tcMar>
+          </w:tcPr>
+          <w:p>
+            <w:pPr>
+              <w:spacing w:after="0"/>
+              <w:jc w:val="center"/>
+            </w:pPr>
+            <w:r>
+              <w:rPr>
+                <w:rFonts w:ascii="Times New Roman" w:hAnsi="Times New Roman" w:eastAsia="Times New Roman"/>
+                <w:b/>
+                <w:sz w:val="15"/>
+              </w:rPr>
+              <w:t>β</w:t>
+            </w:r>
+          </w:p>
+        </w:tc>
+        <w:tc>
+          <w:tcPr>
+            <w:tcW w:type="dxa" w:w="1300"/>
+            <w:shd w:fill="D9E2F3"/>
+            <w:vAlign w:val="center"/>
+            <w:tcMar>
+              <w:top w:w="50" w:type="dxa"/>
+              <w:start w:w="50" w:type="dxa"/>
+              <w:bottom w:w="50" w:type="dxa"/>
+              <w:end w:w="50" w:type="dxa"/>
+            </w:tcMar>
+          </w:tcPr>
+          <w:p>
+            <w:pPr>
+              <w:spacing w:after="0"/>
+              <w:jc w:val="center"/>
+            </w:pPr>
+            <w:r>
+              <w:rPr>
+                <w:rFonts w:ascii="Times New Roman" w:hAnsi="Times New Roman" w:eastAsia="Times New Roman"/>
+                <w:b/>
+                <w:sz w:val="15"/>
+              </w:rPr>
+              <w:t>Угол, °</w:t>
+            </w:r>
+          </w:p>
+        </w:tc>
+        <w:tc>
+          <w:tcPr>
+            <w:tcW w:type="dxa" w:w="1300"/>
+            <w:shd w:fill="D9E2F3"/>
+            <w:vAlign w:val="center"/>
+            <w:tcMar>
+              <w:top w:w="50" w:type="dxa"/>
+              <w:start w:w="50" w:type="dxa"/>
+              <w:bottom w:w="50" w:type="dxa"/>
+              <w:end w:w="50" w:type="dxa"/>
+            </w:tcMar>
+          </w:tcPr>
+          <w:p>
+            <w:pPr>
+              <w:spacing w:after="0"/>
+              <w:jc w:val="center"/>
+            </w:pPr>
+            <w:r>
+              <w:rPr>
+                <w:rFonts w:ascii="Times New Roman" w:hAnsi="Times New Roman" w:eastAsia="Times New Roman"/>
+                <w:b/>
+                <w:sz w:val="15"/>
+              </w:rPr>
+              <w:t>ESS/n</w:t>
+            </w:r>
+          </w:p>
+        </w:tc>
+        <w:tc>
+          <w:tcPr>
+            <w:tcW w:type="dxa" w:w="1550"/>
+            <w:shd w:fill="D9E2F3"/>
+            <w:vAlign w:val="center"/>
+            <w:tcMar>
+              <w:top w:w="50" w:type="dxa"/>
+              <w:start w:w="50" w:type="dxa"/>
+              <w:bottom w:w="50" w:type="dxa"/>
+              <w:end w:w="50" w:type="dxa"/>
+            </w:tcMar>
+          </w:tcPr>
+          <w:p>
+            <w:pPr>
+              <w:spacing w:after="0"/>
+              <w:jc w:val="center"/>
+            </w:pPr>
+            <w:r>
+              <w:rPr>
+                <w:rFonts w:ascii="Times New Roman" w:hAnsi="Times New Roman" w:eastAsia="Times New Roman"/>
+                <w:b/>
+                <w:sz w:val="15"/>
+              </w:rPr>
+              <w:t>Насыщение</w:t>
+            </w:r>
+          </w:p>
+        </w:tc>
+      </w:tr>
+      <w:tr>
+        <w:tc>
+          <w:tcPr>
+            <w:tcW w:type="dxa" w:w="650"/>
+            <w:vAlign w:val="center"/>
+            <w:tcMar>
+              <w:top w:w="50" w:type="dxa"/>
+              <w:start w:w="50" w:type="dxa"/>
+              <w:bottom w:w="50" w:type="dxa"/>
+              <w:end w:w="50" w:type="dxa"/>
+            </w:tcMar>
+          </w:tcPr>
+          <w:p>
+            <w:pPr>
+              <w:spacing w:after="0" w:line="216" w:lineRule="auto"/>
+              <w:jc w:val="center"/>
+            </w:pPr>
+            <w:r>
+              <w:rPr>
+                <w:rFonts w:ascii="Times New Roman" w:hAnsi="Times New Roman" w:eastAsia="Times New Roman"/>
+                <w:sz w:val="15"/>
+              </w:rPr>
+              <w:t>0.1</w:t>
+            </w:r>
+          </w:p>
+        </w:tc>
+        <w:tc>
+          <w:tcPr>
+            <w:tcW w:type="dxa" w:w="1300"/>
+            <w:vAlign w:val="center"/>
+            <w:tcMar>
+              <w:top w:w="50" w:type="dxa"/>
+              <w:start w:w="50" w:type="dxa"/>
+              <w:bottom w:w="50" w:type="dxa"/>
+              <w:end w:w="50" w:type="dxa"/>
+            </w:tcMar>
+          </w:tcPr>
+          <w:p>
+            <w:pPr>
+              <w:spacing w:after="0" w:line="216" w:lineRule="auto"/>
+              <w:jc w:val="center"/>
+            </w:pPr>
+            <w:r>
+              <w:rPr>
+                <w:rFonts w:ascii="Times New Roman" w:hAnsi="Times New Roman" w:eastAsia="Times New Roman"/>
+                <w:sz w:val="15"/>
+              </w:rPr>
+              <w:t>22.99</w:t>
+            </w:r>
+          </w:p>
+        </w:tc>
+        <w:tc>
+          <w:tcPr>
+            <w:tcW w:type="dxa" w:w="1300"/>
+            <w:vAlign w:val="center"/>
+            <w:tcMar>
+              <w:top w:w="50" w:type="dxa"/>
+              <w:start w:w="50" w:type="dxa"/>
+              <w:bottom w:w="50" w:type="dxa"/>
+              <w:end w:w="50" w:type="dxa"/>
+            </w:tcMar>
+          </w:tcPr>
+          <w:p>
+            <w:pPr>
+              <w:spacing w:after="0" w:line="216" w:lineRule="auto"/>
+              <w:jc w:val="center"/>
+            </w:pPr>
+            <w:r>
+              <w:rPr>
+                <w:rFonts w:ascii="Times New Roman" w:hAnsi="Times New Roman" w:eastAsia="Times New Roman"/>
+                <w:sz w:val="15"/>
+              </w:rPr>
+              <w:t>0.9996</w:t>
+            </w:r>
+          </w:p>
+        </w:tc>
+        <w:tc>
+          <w:tcPr>
+            <w:tcW w:type="dxa" w:w="1550"/>
+            <w:vAlign w:val="center"/>
+            <w:tcMar>
+              <w:top w:w="50" w:type="dxa"/>
+              <w:start w:w="50" w:type="dxa"/>
+              <w:bottom w:w="50" w:type="dxa"/>
+              <w:end w:w="50" w:type="dxa"/>
+            </w:tcMar>
+          </w:tcPr>
+          <w:p>
+            <w:pPr>
+              <w:spacing w:after="0" w:line="216" w:lineRule="auto"/>
+              <w:jc w:val="center"/>
+            </w:pPr>
+            <w:r>
+              <w:rPr>
+                <w:rFonts w:ascii="Times New Roman" w:hAnsi="Times New Roman" w:eastAsia="Times New Roman"/>
+                <w:sz w:val="15"/>
+              </w:rPr>
+              <w:t>0.0000</w:t>
+            </w:r>
+          </w:p>
+        </w:tc>
+      </w:tr>
+      <w:tr>
+        <w:tc>
+          <w:tcPr>
+            <w:tcW w:type="dxa" w:w="650"/>
+            <w:vAlign w:val="center"/>
+            <w:tcMar>
+              <w:top w:w="50" w:type="dxa"/>
+              <w:start w:w="50" w:type="dxa"/>
+              <w:bottom w:w="50" w:type="dxa"/>
+              <w:end w:w="50" w:type="dxa"/>
+            </w:tcMar>
+          </w:tcPr>
+          <w:p>
+            <w:pPr>
+              <w:spacing w:after="0" w:line="216" w:lineRule="auto"/>
+              <w:jc w:val="center"/>
+            </w:pPr>
+            <w:r>
+              <w:rPr>
+                <w:rFonts w:ascii="Times New Roman" w:hAnsi="Times New Roman" w:eastAsia="Times New Roman"/>
+                <w:sz w:val="15"/>
+              </w:rPr>
+              <w:t>0.3</w:t>
+            </w:r>
+          </w:p>
+        </w:tc>
+        <w:tc>
+          <w:tcPr>
+            <w:tcW w:type="dxa" w:w="1300"/>
+            <w:vAlign w:val="center"/>
+            <w:tcMar>
+              <w:top w:w="50" w:type="dxa"/>
+              <w:start w:w="50" w:type="dxa"/>
+              <w:bottom w:w="50" w:type="dxa"/>
+              <w:end w:w="50" w:type="dxa"/>
+            </w:tcMar>
+          </w:tcPr>
+          <w:p>
+            <w:pPr>
+              <w:spacing w:after="0" w:line="216" w:lineRule="auto"/>
+              <w:jc w:val="center"/>
+            </w:pPr>
+            <w:r>
+              <w:rPr>
+                <w:rFonts w:ascii="Times New Roman" w:hAnsi="Times New Roman" w:eastAsia="Times New Roman"/>
+                <w:sz w:val="15"/>
+              </w:rPr>
+              <w:t>16.82</w:t>
+            </w:r>
+          </w:p>
+        </w:tc>
+        <w:tc>
+          <w:tcPr>
+            <w:tcW w:type="dxa" w:w="1300"/>
+            <w:vAlign w:val="center"/>
+            <w:tcMar>
+              <w:top w:w="50" w:type="dxa"/>
+              <w:start w:w="50" w:type="dxa"/>
+              <w:bottom w:w="50" w:type="dxa"/>
+              <w:end w:w="50" w:type="dxa"/>
+            </w:tcMar>
+          </w:tcPr>
+          <w:p>
+            <w:pPr>
+              <w:spacing w:after="0" w:line="216" w:lineRule="auto"/>
+              <w:jc w:val="center"/>
+            </w:pPr>
+            <w:r>
+              <w:rPr>
+                <w:rFonts w:ascii="Times New Roman" w:hAnsi="Times New Roman" w:eastAsia="Times New Roman"/>
+                <w:sz w:val="15"/>
+              </w:rPr>
+              <w:t>0.9966</w:t>
+            </w:r>
+          </w:p>
+        </w:tc>
+        <w:tc>
+          <w:tcPr>
+            <w:tcW w:type="dxa" w:w="1550"/>
+            <w:vAlign w:val="center"/>
+            <w:tcMar>
+              <w:top w:w="50" w:type="dxa"/>
+              <w:start w:w="50" w:type="dxa"/>
+              <w:bottom w:w="50" w:type="dxa"/>
+              <w:end w:w="50" w:type="dxa"/>
+            </w:tcMar>
+          </w:tcPr>
+          <w:p>
+            <w:pPr>
+              <w:spacing w:after="0" w:line="216" w:lineRule="auto"/>
+              <w:jc w:val="center"/>
+            </w:pPr>
+            <w:r>
+              <w:rPr>
+                <w:rFonts w:ascii="Times New Roman" w:hAnsi="Times New Roman" w:eastAsia="Times New Roman"/>
+                <w:sz w:val="15"/>
+              </w:rPr>
+              <w:t>0.0000</w:t>
+            </w:r>
+          </w:p>
+        </w:tc>
+      </w:tr>
+      <w:tr>
+        <w:tc>
+          <w:tcPr>
+            <w:tcW w:type="dxa" w:w="650"/>
+            <w:vAlign w:val="center"/>
+            <w:tcMar>
+              <w:top w:w="50" w:type="dxa"/>
+              <w:start w:w="50" w:type="dxa"/>
+              <w:bottom w:w="50" w:type="dxa"/>
+              <w:end w:w="50" w:type="dxa"/>
+            </w:tcMar>
+          </w:tcPr>
+          <w:p>
+            <w:pPr>
+              <w:spacing w:after="0" w:line="216" w:lineRule="auto"/>
+              <w:jc w:val="center"/>
+            </w:pPr>
+            <w:r>
+              <w:rPr>
+                <w:rFonts w:ascii="Times New Roman" w:hAnsi="Times New Roman" w:eastAsia="Times New Roman"/>
+                <w:sz w:val="15"/>
+              </w:rPr>
+              <w:t>1</w:t>
+            </w:r>
+          </w:p>
+        </w:tc>
+        <w:tc>
+          <w:tcPr>
+            <w:tcW w:type="dxa" w:w="1300"/>
+            <w:vAlign w:val="center"/>
+            <w:tcMar>
+              <w:top w:w="50" w:type="dxa"/>
+              <w:start w:w="50" w:type="dxa"/>
+              <w:bottom w:w="50" w:type="dxa"/>
+              <w:end w:w="50" w:type="dxa"/>
+            </w:tcMar>
+          </w:tcPr>
+          <w:p>
+            <w:pPr>
+              <w:spacing w:after="0" w:line="216" w:lineRule="auto"/>
+              <w:jc w:val="center"/>
+            </w:pPr>
+            <w:r>
+              <w:rPr>
+                <w:rFonts w:ascii="Times New Roman" w:hAnsi="Times New Roman" w:eastAsia="Times New Roman"/>
+                <w:sz w:val="15"/>
+              </w:rPr>
+              <w:t>0.00</w:t>
+            </w:r>
+          </w:p>
+        </w:tc>
+        <w:tc>
+          <w:tcPr>
+            <w:tcW w:type="dxa" w:w="1300"/>
+            <w:vAlign w:val="center"/>
+            <w:tcMar>
+              <w:top w:w="50" w:type="dxa"/>
+              <w:start w:w="50" w:type="dxa"/>
+              <w:bottom w:w="50" w:type="dxa"/>
+              <w:end w:w="50" w:type="dxa"/>
+            </w:tcMar>
+          </w:tcPr>
+          <w:p>
+            <w:pPr>
+              <w:spacing w:after="0" w:line="216" w:lineRule="auto"/>
+              <w:jc w:val="center"/>
+            </w:pPr>
+            <w:r>
+              <w:rPr>
+                <w:rFonts w:ascii="Times New Roman" w:hAnsi="Times New Roman" w:eastAsia="Times New Roman"/>
+                <w:sz w:val="15"/>
+              </w:rPr>
+              <w:t>0.9664</w:t>
+            </w:r>
+          </w:p>
+        </w:tc>
+        <w:tc>
+          <w:tcPr>
+            <w:tcW w:type="dxa" w:w="1550"/>
+            <w:vAlign w:val="center"/>
+            <w:tcMar>
+              <w:top w:w="50" w:type="dxa"/>
+              <w:start w:w="50" w:type="dxa"/>
+              <w:bottom w:w="50" w:type="dxa"/>
+              <w:end w:w="50" w:type="dxa"/>
+            </w:tcMar>
+          </w:tcPr>
+          <w:p>
+            <w:pPr>
+              <w:spacing w:after="0" w:line="216" w:lineRule="auto"/>
+              <w:jc w:val="center"/>
+            </w:pPr>
+            <w:r>
+              <w:rPr>
+                <w:rFonts w:ascii="Times New Roman" w:hAnsi="Times New Roman" w:eastAsia="Times New Roman"/>
+                <w:sz w:val="15"/>
+              </w:rPr>
+              <w:t>0.0000</w:t>
+            </w:r>
+          </w:p>
+        </w:tc>
+      </w:tr>
+      <w:tr>
+        <w:tc>
+          <w:tcPr>
+            <w:tcW w:type="dxa" w:w="650"/>
+            <w:vAlign w:val="center"/>
+            <w:tcMar>
+              <w:top w:w="50" w:type="dxa"/>
+              <w:start w:w="50" w:type="dxa"/>
+              <w:bottom w:w="50" w:type="dxa"/>
+              <w:end w:w="50" w:type="dxa"/>
+            </w:tcMar>
+          </w:tcPr>
+          <w:p>
+            <w:pPr>
+              <w:spacing w:after="0" w:line="216" w:lineRule="auto"/>
+              <w:jc w:val="center"/>
+            </w:pPr>
+            <w:r>
+              <w:rPr>
+                <w:rFonts w:ascii="Times New Roman" w:hAnsi="Times New Roman" w:eastAsia="Times New Roman"/>
+                <w:sz w:val="15"/>
+              </w:rPr>
+              <w:t>3</w:t>
+            </w:r>
+          </w:p>
+        </w:tc>
+        <w:tc>
+          <w:tcPr>
+            <w:tcW w:type="dxa" w:w="1300"/>
+            <w:vAlign w:val="center"/>
+            <w:tcMar>
+              <w:top w:w="50" w:type="dxa"/>
+              <w:start w:w="50" w:type="dxa"/>
+              <w:bottom w:w="50" w:type="dxa"/>
+              <w:end w:w="50" w:type="dxa"/>
+            </w:tcMar>
+          </w:tcPr>
+          <w:p>
+            <w:pPr>
+              <w:spacing w:after="0" w:line="216" w:lineRule="auto"/>
+              <w:jc w:val="center"/>
+            </w:pPr>
+            <w:r>
+              <w:rPr>
+                <w:rFonts w:ascii="Times New Roman" w:hAnsi="Times New Roman" w:eastAsia="Times New Roman"/>
+                <w:sz w:val="15"/>
+              </w:rPr>
+              <w:t>19.44</w:t>
+            </w:r>
+          </w:p>
+        </w:tc>
+        <w:tc>
+          <w:tcPr>
+            <w:tcW w:type="dxa" w:w="1300"/>
+            <w:vAlign w:val="center"/>
+            <w:tcMar>
+              <w:top w:w="50" w:type="dxa"/>
+              <w:start w:w="50" w:type="dxa"/>
+              <w:bottom w:w="50" w:type="dxa"/>
+              <w:end w:w="50" w:type="dxa"/>
+            </w:tcMar>
+          </w:tcPr>
+          <w:p>
+            <w:pPr>
+              <w:spacing w:after="0" w:line="216" w:lineRule="auto"/>
+              <w:jc w:val="center"/>
+            </w:pPr>
+            <w:r>
+              <w:rPr>
+                <w:rFonts w:ascii="Times New Roman" w:hAnsi="Times New Roman" w:eastAsia="Times New Roman"/>
+                <w:sz w:val="15"/>
+              </w:rPr>
+              <w:t>0.8345</w:t>
+            </w:r>
+          </w:p>
+        </w:tc>
+        <w:tc>
+          <w:tcPr>
+            <w:tcW w:type="dxa" w:w="1550"/>
+            <w:vAlign w:val="center"/>
+            <w:tcMar>
+              <w:top w:w="50" w:type="dxa"/>
+              <w:start w:w="50" w:type="dxa"/>
+              <w:bottom w:w="50" w:type="dxa"/>
+              <w:end w:w="50" w:type="dxa"/>
+            </w:tcMar>
+          </w:tcPr>
+          <w:p>
+            <w:pPr>
+              <w:spacing w:after="0" w:line="216" w:lineRule="auto"/>
+              <w:jc w:val="center"/>
+            </w:pPr>
+            <w:r>
+              <w:rPr>
+                <w:rFonts w:ascii="Times New Roman" w:hAnsi="Times New Roman" w:eastAsia="Times New Roman"/>
+                <w:sz w:val="15"/>
+              </w:rPr>
+              <w:t>0.0312</w:t>
+            </w:r>
+          </w:p>
+        </w:tc>
+      </w:tr>
+      <w:tr>
+        <w:tc>
+          <w:tcPr>
+            <w:tcW w:type="dxa" w:w="650"/>
+            <w:vAlign w:val="center"/>
+            <w:tcMar>
+              <w:top w:w="50" w:type="dxa"/>
+              <w:start w:w="50" w:type="dxa"/>
+              <w:bottom w:w="50" w:type="dxa"/>
+              <w:end w:w="50" w:type="dxa"/>
+            </w:tcMar>
+          </w:tcPr>
+          <w:p>
+            <w:pPr>
+              <w:spacing w:after="0" w:line="216" w:lineRule="auto"/>
+              <w:jc w:val="center"/>
+            </w:pPr>
+            <w:r>
+              <w:rPr>
+                <w:rFonts w:ascii="Times New Roman" w:hAnsi="Times New Roman" w:eastAsia="Times New Roman"/>
+                <w:sz w:val="15"/>
+              </w:rPr>
+              <w:t>10</w:t>
+            </w:r>
+          </w:p>
+        </w:tc>
+        <w:tc>
+          <w:tcPr>
+            <w:tcW w:type="dxa" w:w="1300"/>
+            <w:vAlign w:val="center"/>
+            <w:tcMar>
+              <w:top w:w="50" w:type="dxa"/>
+              <w:start w:w="50" w:type="dxa"/>
+              <w:bottom w:w="50" w:type="dxa"/>
+              <w:end w:w="50" w:type="dxa"/>
+            </w:tcMar>
+          </w:tcPr>
+          <w:p>
+            <w:pPr>
+              <w:spacing w:after="0" w:line="216" w:lineRule="auto"/>
+              <w:jc w:val="center"/>
+            </w:pPr>
+            <w:r>
+              <w:rPr>
+                <w:rFonts w:ascii="Times New Roman" w:hAnsi="Times New Roman" w:eastAsia="Times New Roman"/>
+                <w:sz w:val="15"/>
+              </w:rPr>
+              <w:t>30.39</w:t>
+            </w:r>
+          </w:p>
+        </w:tc>
+        <w:tc>
+          <w:tcPr>
+            <w:tcW w:type="dxa" w:w="1300"/>
+            <w:vAlign w:val="center"/>
+            <w:tcMar>
+              <w:top w:w="50" w:type="dxa"/>
+              <w:start w:w="50" w:type="dxa"/>
+              <w:bottom w:w="50" w:type="dxa"/>
+              <w:end w:w="50" w:type="dxa"/>
+            </w:tcMar>
+          </w:tcPr>
+          <w:p>
+            <w:pPr>
+              <w:spacing w:after="0" w:line="216" w:lineRule="auto"/>
+              <w:jc w:val="center"/>
+            </w:pPr>
+            <w:r>
+              <w:rPr>
+                <w:rFonts w:ascii="Times New Roman" w:hAnsi="Times New Roman" w:eastAsia="Times New Roman"/>
+                <w:sz w:val="15"/>
+              </w:rPr>
+              <w:t>0.6199</w:t>
+            </w:r>
+          </w:p>
+        </w:tc>
+        <w:tc>
+          <w:tcPr>
+            <w:tcW w:type="dxa" w:w="1550"/>
+            <w:vAlign w:val="center"/>
+            <w:tcMar>
+              <w:top w:w="50" w:type="dxa"/>
+              <w:start w:w="50" w:type="dxa"/>
+              <w:bottom w:w="50" w:type="dxa"/>
+              <w:end w:w="50" w:type="dxa"/>
+            </w:tcMar>
+          </w:tcPr>
+          <w:p>
+            <w:pPr>
+              <w:spacing w:after="0" w:line="216" w:lineRule="auto"/>
+              <w:jc w:val="center"/>
+            </w:pPr>
+            <w:r>
+              <w:rPr>
+                <w:rFonts w:ascii="Times New Roman" w:hAnsi="Times New Roman" w:eastAsia="Times New Roman"/>
+                <w:sz w:val="15"/>
+              </w:rPr>
+              <w:t>0.3125</w:t>
+            </w:r>
+          </w:p>
+        </w:tc>
+      </w:tr>
+    </w:tbl>
+    <w:p>
+      <w:pPr>
+        <w:pStyle w:val="a3"/>
+        <w:keepLines w:val="0"/>
+      </w:pPr>
+      <w:r>
+        <w:rPr>
+          <w:rFonts w:ascii="Times New Roman" w:hAnsi="Times New Roman" w:eastAsia="Times New Roman"/>
+          <w:sz w:val="20"/>
+        </w:rPr>
+        <w:t>Геометрический эффект воспроизвёлся в обучаемом нейросетевом подпространстве. При β=0,1 угол к градиенту β=1 равен 22,99°, при β=3 — 19,44°, при β=10 — 30,39°. Одновременно ESS/n уменьшился до 0,6199, а доля насыщенных весов выросла до 0,3125. Следовательно, температурное масштабирование меняет направление обновления не только у линейного суррогата, но и у LoRA-адаптера.</w:t>
       </w:r>
     </w:p>
     <w:p>
@@ -2870,7 +4132,7 @@
           <w:rFonts w:ascii="Times New Roman" w:hAnsi="Times New Roman" w:eastAsia="Times New Roman"/>
           <w:sz w:val="20"/>
         </w:rPr>
-        <w:t>Сравнение потерь показывает, что различие между разностной и абсолютной идентификацией сохраняется на реальных парах. В данной постановке парная модель устойчивее при β≥1, однако эффект нельзя переносить на полноразмерный DPO без дополнительной проверки. Фиксированные хешированные признаки не моделируют изменение внутренних представлений трансформера, а первые производные вычисляются в пространстве линейного скорера. Поэтому результат следует трактовать как контролируемую диагностику оптимизационного механизма.</w:t>
+        <w:t>Сравнение потерь показывает, что различие между разностной и абсолютной идентификацией сохраняется на реальных парах. LoRA-эксперимент переносит анализ с фиксированных признаков на внутренние представления Transformer, но отсутствие среднего прироста accuracy ограничивает практический вывод. Результат согласуется с идеей KTO о зависимости подходящей функции потерь от предположений о человеческой полезности [20]: параметризация адаптера сама по себе не устраняет несоответствие малой выборки и целевой метрики.</w:t>
       </w:r>
     </w:p>
     <w:p>
@@ -2883,7 +4145,7 @@
           <w:rFonts w:ascii="Times New Roman" w:hAnsi="Times New Roman" w:eastAsia="Times New Roman"/>
           <w:sz w:val="20"/>
         </w:rPr>
-        <w:t>К ограничениям относятся один англоязычный датасет, одна детерминированная выборка, отсутствие группировки по helpfulness/harmlessness и небольшой тестовый объём. Дальнейшая работа должна повторить протокол на нескольких открытых языковых моделях, логировать градиенты LoRA-параметров, варьировать состав мини-пакета и отдельно исследовать ошибочные предпочтения. Для русскоязычного переноса нужен сопоставимый корпус пар и контроль длины ответа.</w:t>
+        <w:t>К ограничениям относятся один англоязычный датасет, компактный BERT вместо генеративной LLM, три нейросетевых seed, один ранг и отсутствие внешней оценки RewardBench. Дальнейшая работа должна сравнить LoRA, LoRA+ и PiSSA на моделях 1–7 млрд параметров, включить несколько β в обучение, логировать послойные углы и проверять перенос на RewardBench. Для русскоязычного переноса нужен сопоставимый корпус пар и контроль длины ответа.</w:t>
       </w:r>
     </w:p>
     <w:p>
@@ -2910,7 +4172,7 @@
           <w:rFonts w:ascii="Times New Roman" w:hAnsi="Times New Roman" w:eastAsia="Times New Roman"/>
           <w:sz w:val="20"/>
         </w:rPr>
-        <w:t>Эксперимент на реальных данных HH-RLHF подтвердил два вывода. Во-первых, β является геометрическим гиперпараметром: при неизменной точке модели он повернул пакетный градиент до 34,71° и уменьшил ESS/n до 0,7141. Во-вторых, парная и поэлементная потери дают различную динамику даже при общем представлении ответов; оптимум обеих моделей находился при умеренном β=0,3, а большое β ухудшало ранжирование. Практически β следует выбирать совместно с функцией потерь и контролировать через угол градиента, ESS и насыщение весов, а не только через величину training loss.</w:t>
+        <w:t>Эксперимент на реальных данных HH-RLHF подтвердил три вывода. Во-первых, β является геометрическим гиперпараметром: в линейной модели он повернул градиент до 34,71°. Во-вторых, этот механизм сохранился в пространстве LoRA: при β=10 угол достиг 30,39°, ESS/n уменьшился до 0,6199. В-третьих, обучение 0,189% параметров не гарантировало прироста точности на 1400 парах; ранняя остановка выбирала первую эпоху всех LoRA-запусков. Практически β, функцию потерь и параметризацию адаптера следует выбирать совместно и контролировать через угол градиента, ESS, насыщение весов и внешнюю валидацию.</w:t>
       </w:r>
     </w:p>
     <w:p>
@@ -3108,6 +4370,110 @@
           <w:sz w:val="16"/>
         </w:rPr>
         <w:t>B. Efron and R. J. Tibshirani, An Introduction to the Bootstrap. New York, NY, USA: Chapman &amp; Hall, 1993.</w:t>
+      </w:r>
+    </w:p>
+    <w:p>
+      <w:pPr>
+        <w:pStyle w:val="references"/>
+        <w:keepLines/>
+      </w:pPr>
+      <w:r>
+        <w:rPr>
+          <w:rFonts w:ascii="Times New Roman" w:hAnsi="Times New Roman" w:eastAsia="Times New Roman"/>
+          <w:sz w:val="16"/>
+        </w:rPr>
+        <w:t>E. J. Hu et al., “LoRA: Low-rank adaptation of large language models,” in Proc. Int. Conf. Learning Representations, 2022.</w:t>
+      </w:r>
+    </w:p>
+    <w:p>
+      <w:pPr>
+        <w:pStyle w:val="references"/>
+        <w:keepLines/>
+      </w:pPr>
+      <w:r>
+        <w:rPr>
+          <w:rFonts w:ascii="Times New Roman" w:hAnsi="Times New Roman" w:eastAsia="Times New Roman"/>
+          <w:sz w:val="16"/>
+        </w:rPr>
+        <w:t>T. Dettmers, A. Pagnoni, A. Holtzman, and L. Zettlemoyer, “QLoRA: Efficient finetuning of quantized LLMs,” in Advances in Neural Information Processing Systems, vol. 36, 2023, pp. 10088–10115.</w:t>
+      </w:r>
+    </w:p>
+    <w:p>
+      <w:pPr>
+        <w:pStyle w:val="references"/>
+        <w:keepLines/>
+      </w:pPr>
+      <w:r>
+        <w:rPr>
+          <w:rFonts w:ascii="Times New Roman" w:hAnsi="Times New Roman" w:eastAsia="Times New Roman"/>
+          <w:sz w:val="16"/>
+        </w:rPr>
+        <w:t>S. Hayou, N. Ghosh, and B. Yu, “LoRA+: Efficient low rank adaptation of large models,” in Proc. 41st Int. Conf. Machine Learning, PMLR 235, 2024, pp. 17783–17806.</w:t>
+      </w:r>
+    </w:p>
+    <w:p>
+      <w:pPr>
+        <w:pStyle w:val="references"/>
+        <w:keepLines/>
+      </w:pPr>
+      <w:r>
+        <w:rPr>
+          <w:rFonts w:ascii="Times New Roman" w:hAnsi="Times New Roman" w:eastAsia="Times New Roman"/>
+          <w:sz w:val="16"/>
+        </w:rPr>
+        <w:t>S.-Y. Liu et al., “DoRA: Weight-decomposed low-rank adaptation,” in Proc. 41st Int. Conf. Machine Learning, PMLR 235, 2024, pp. 32100–32121.</w:t>
+      </w:r>
+    </w:p>
+    <w:p>
+      <w:pPr>
+        <w:pStyle w:val="references"/>
+        <w:keepLines/>
+      </w:pPr>
+      <w:r>
+        <w:rPr>
+          <w:rFonts w:ascii="Times New Roman" w:hAnsi="Times New Roman" w:eastAsia="Times New Roman"/>
+          <w:sz w:val="16"/>
+        </w:rPr>
+        <w:t>F. Meng, Z. Wang, and M. Zhang, “PiSSA: Principal singular values and singular vectors adaptation of large language models,” in Advances in Neural Information Processing Systems, vol. 37, 2024, doi: 10.52202/079017-3846.</w:t>
+      </w:r>
+    </w:p>
+    <w:p>
+      <w:pPr>
+        <w:pStyle w:val="references"/>
+        <w:keepLines/>
+      </w:pPr>
+      <w:r>
+        <w:rPr>
+          <w:rFonts w:ascii="Times New Roman" w:hAnsi="Times New Roman" w:eastAsia="Times New Roman"/>
+          <w:sz w:val="16"/>
+        </w:rPr>
+        <w:t>N. Lambert et al., “RewardBench: Evaluating reward models for language modeling,” in Findings of NAACL, 2025, pp. 1755–1797, doi: 10.18653/v1/2025.findings-naacl.96.</w:t>
+      </w:r>
+    </w:p>
+    <w:p>
+      <w:pPr>
+        <w:pStyle w:val="references"/>
+        <w:keepLines/>
+      </w:pPr>
+      <w:r>
+        <w:rPr>
+          <w:rFonts w:ascii="Times New Roman" w:hAnsi="Times New Roman" w:eastAsia="Times New Roman"/>
+          <w:sz w:val="16"/>
+        </w:rPr>
+        <w:t>K. Yang, Z. Liu, Q. Xie, J. Huang, E. Min, and S. Ananiadou, “Selective preference optimization via token-level reward function estimation,” in Proc. EMNLP, 2025, pp. 7032–7056, doi: 10.18653/v1/2025.emnlp-main.359.</w:t>
+      </w:r>
+    </w:p>
+    <w:p>
+      <w:pPr>
+        <w:pStyle w:val="references"/>
+        <w:keepLines/>
+      </w:pPr>
+      <w:r>
+        <w:rPr>
+          <w:rFonts w:ascii="Times New Roman" w:hAnsi="Times New Roman" w:eastAsia="Times New Roman"/>
+          <w:sz w:val="16"/>
+        </w:rPr>
+        <w:t>K. Ethayarajh, W. Xu, N. Muennighoff, D. Jurafsky, and D. Kiela, “Model alignment as prospect theoretic optimization,” in Proc. 41st Int. Conf. Machine Learning, PMLR 235, 2024, pp. 12634–12651.</w:t>
       </w:r>
     </w:p>
     <w:p>

</xml_diff>

<commit_message>
Add TinyLlama RewardBench pilot and sector applications
</commit_message>
<xml_diff>
--- a/article/SUMMA2026_RU_gradient_geometry.docx
+++ b/article/SUMMA2026_RU_gradient_geometry.docx
@@ -100,7 +100,7 @@
           <w:i w:val="0"/>
           <w:sz w:val="18"/>
         </w:rPr>
-        <w:t>Исследуется влияние температурного параметра β на геометрию пакетного градиента и низкоранговую адаптацию reward-модели. Эксперимент выполнен на 2000 реальных парах Anthropic HH-RLHF. В линейной постановке при изменении β от 0,1 до 10 угол градиента достиг 34,71°, а ESS/n уменьшился до 0,7141; максимальная точность парной модели составила 0,5627±0,0072 при β=0,3. Дополнительно предобученный BERT-tiny адаптирован методом LoRA ранга 8: обучались 8321 из 4394241 параметров (0,189%). По трём инициализациям LoRA получила точность 0,5333±0,0200 против 0,5467±0,0058 у замороженного энкодера с обучаемой головой, то есть прирост качества на малой выборке не подтверждён. При этом в пространстве LoRA-параметров β=10 повернул градиент на 30,39°, снизил ESS/n до 0,6199 и насытил 31,25% весов. Результаты подтверждают геометрический механизм в нейросетевой модели и показывают необходимость ранней остановки и нескольких seed.</w:t>
+        <w:t>Исследуется влияние температурного параметра β на геометрию пакетного градиента и низкоранговую адаптацию reward-модели. Эксперимент выполнен на 2000 реальных парах Anthropic HH-RLHF. В линейной постановке при изменении β от 0,1 до 10 угол градиента достиг 34,71°, а ESS/n уменьшился до 0,7141. В BERT-tiny геометрический эффект воспроизведён в пространстве LoRA-параметров. Внешний CPU-пилот на TinyLlama 1,1B обучал 0,0546% параметров и оценивался на стратифицированной выборке 92 примеров RewardBench. Micro accuracy изменилась с 42,39% до 45,65%, но 95%-й bootstrap-интервал изменения включал ноль (−4,35…10,87 п.п.; p=0,581); на 48 отложенных HH-парах точность снизилась с 47,92% до 45,83%. Результат подтверждает вычислительную применимость LoRA к модели миллиардного масштаба, но показывает необходимость категориальной внешней проверки.</w:t>
       </w:r>
     </w:p>
     <w:p>
@@ -124,7 +124,7 @@
           <w:i/>
           <w:sz w:val="18"/>
         </w:rPr>
-        <w:t>оптимизация предпочтений; геометрия градиента; LoRA; reward-модель; температурное масштабирование; HH-RLHF</w:t>
+        <w:t>оптимизация предпочтений; геометрия градиента; LoRA; reward-модель; RewardBench; TinyLlama</w:t>
       </w:r>
     </w:p>
     <w:p>
@@ -191,6 +191,19 @@
           <w:sz w:val="20"/>
         </w:rPr>
         <w:t>Параметрически эффективное обучение дополняет эту постановку. LoRA ограничивает обновление весовой матрицы низкоранговым подпространством [13], QLoRA сочетает его с квантизацией [14], а LoRA+, DoRA и PiSSA уточняют скорости обучения, разложение веса и инициализацию адаптера [15]–[17]. Современная оценка reward-моделей показывает необходимость внешних и устойчивых проверок [18], а SePO переносит предпочтительный сигнал на информативные токены [19]. Поэтому второй эксперимент проверяет нашу геометрическую гипотезу непосредственно в пространстве LoRA-параметров.</w:t>
+      </w:r>
+    </w:p>
+    <w:p>
+      <w:pPr>
+        <w:pStyle w:val="a3"/>
+        <w:keepLines w:val="0"/>
+      </w:pPr>
+      <w:r>
+        <w:rPr>
+          <w:rFonts w:ascii="Times New Roman" w:hAnsi="Times New Roman" w:eastAsia="Times New Roman"/>
+          <w:sz w:val="20"/>
+        </w:rPr>
+        <w:t>Практическая актуальность связана с системами, где требуется выбрать лучший из нескольких сгенерированных ответов: контакт-центрами, финансовым комплаенсом, образовательной обратной связью, информационными материалами здравоохранения, промышленными инструкциями, государственными услугами и проверкой программного кода. В таких сценариях reward-модель должна быть вспомогательным фильтром, а не автономным источником юридически, клинически или технологически значимого решения. Межотраслевой профиль NIST требует контекстной оценки рисков генеративного ИИ [22], а OECD фиксирует одновременно расширение практических применений и риски непрозрачности, смещений и чрезмерного доверия [23], [24].</w:t>
       </w:r>
     </w:p>
     <w:p>
@@ -725,7 +738,7 @@
           <w:i/>
           <w:sz w:val="20"/>
         </w:rPr>
-        <w:t>Проверки и метрики</w:t>
+        <w:t>Модель 1,1B и внешняя проверка</w:t>
       </w:r>
     </w:p>
     <w:p>
@@ -738,7 +751,34 @@
           <w:rFonts w:ascii="Times New Roman" w:hAnsi="Times New Roman" w:eastAsia="Times New Roman"/>
           <w:sz w:val="20"/>
         </w:rPr>
-        <w:t>Аналитические градиенты обеих потерь проверены центральными конечными разностями: абсолютная ошибка направленной производной составила 6,65·10⁻¹³ для парной и 8,11·10⁻¹¹ для поэлементной потери. Дополнительно проверены границы ESS, углы опорных векторов, отсутствие пересечения выборок и повторяемость хеширования. Оценивались угол между градиентами, норма, ESS, доля весов вне интервала [0,05;0,95], ranking accuracy, логистическая потеря, Brier score и ECE [10]. Для точности рассчитаны bootstrap-интервалы по 2000 повторным выборкам [12].</w:t>
+        <w:t>Для проверки масштаба 1–3 млрд параметров использована TinyLlama-1.1B-Chat-v1.0 [21] как Llama-подобная reward-модель со скалярной классификационной головой. LoRA ранга 4 (α=8, dropout 0,05) применялась к q_proj и v_proj; обучались 565248 из 1035079680 параметров (0,0546%). Из-за CPU-ограничения выполнен заранее фиксированный пилот: 24 шага по 24 обучающим HH-парам, β=0,3, длина 64 токена. До и после адаптации модель проверена на 48 непересекающихся HH-парах и на 92 примерах RewardBench — по четыре примера из каждого из 23 поднаборов. Это диагностическая стратифицированная выборка, а не официальный агрегат leaderboard [18].</w:t>
+      </w:r>
+    </w:p>
+    <w:p>
+      <w:pPr>
+        <w:pStyle w:val="2"/>
+        <w:keepNext/>
+      </w:pPr>
+      <w:r>
+        <w:rPr>
+          <w:rFonts w:ascii="Times New Roman" w:hAnsi="Times New Roman" w:eastAsia="Times New Roman"/>
+          <w:i/>
+          <w:sz w:val="20"/>
+        </w:rPr>
+        <w:t>Проверки и метрики</w:t>
+      </w:r>
+    </w:p>
+    <w:p>
+      <w:pPr>
+        <w:pStyle w:val="a3"/>
+        <w:keepLines w:val="0"/>
+      </w:pPr>
+      <w:r>
+        <w:rPr>
+          <w:rFonts w:ascii="Times New Roman" w:hAnsi="Times New Roman" w:eastAsia="Times New Roman"/>
+          <w:sz w:val="20"/>
+        </w:rPr>
+        <w:t>Аналитические градиенты обеих потерь проверены центральными конечными разностями: абсолютная ошибка направленной производной составила 6,65·10⁻¹³ для парной и 8,11·10⁻¹¹ для поэлементной потери. Проверены границы ESS, углы опорных векторов, отсутствие пересечения выборок, повторяемость хеширования и контрольные суммы данных. Оценивались угол, норма, ESS, насыщение, ranking accuracy, log loss, Brier и ECE [10]. Для точности рассчитаны bootstrap-интервалы [12]; изменение на одинаковых RewardBench-примерах дополнительно проверено двусторонним точным sign test.</w:t>
       </w:r>
     </w:p>
     <w:p>
@@ -753,14 +793,6 @@
           <w:sz w:val="20"/>
         </w:rPr>
         <w:t>РЕЗУЛЬТАТЫ</w:t>
-      </w:r>
-    </w:p>
-    <w:p>
-      <w:pPr>
-        <w:spacing w:after="0"/>
-      </w:pPr>
-      <w:r>
-        <w:br w:type="column"/>
       </w:r>
     </w:p>
     <w:p>
@@ -1489,14 +1521,6 @@
     </w:p>
     <w:p>
       <w:pPr>
-        <w:spacing w:after="0"/>
-      </w:pPr>
-      <w:r>
-        <w:br w:type="column"/>
-      </w:r>
-    </w:p>
-    <w:p>
-      <w:pPr>
         <w:pStyle w:val="tablehead"/>
         <w:keepNext/>
       </w:pPr>
@@ -4106,9 +4130,769 @@
           <w:i w:val="0"/>
           <w:sz w:val="20"/>
         </w:rPr>
-        <w:t>ОБСУЖДЕНИЕ</w:t>
-      </w:r>
-    </w:p>
+        <w:t>ВНЕШНИЙ ПИЛОТ TINYLLAMA 1,1B</w:t>
+      </w:r>
+    </w:p>
+    <w:p>
+      <w:pPr>
+        <w:pStyle w:val="tablehead"/>
+        <w:keepNext/>
+      </w:pPr>
+      <w:r>
+        <w:rPr>
+          <w:rFonts w:ascii="Times New Roman" w:hAnsi="Times New Roman" w:eastAsia="Times New Roman"/>
+          <w:sz w:val="16"/>
+        </w:rPr>
+        <w:t>ТОЧНОСТЬ НА СТРАТИФИЦИРОВАННОЙ ВЫБОРКЕ REWARDBENCH, %</w:t>
+      </w:r>
+    </w:p>
+    <w:tbl>
+      <w:tblPr>
+        <w:tblW w:type="auto" w:w="0"/>
+        <w:jc w:val="center"/>
+        <w:tblLayout w:type="fixed"/>
+        <w:tblLook w:firstColumn="1" w:firstRow="1" w:lastColumn="0" w:lastRow="0" w:noHBand="0" w:noVBand="1" w:val="04A0"/>
+        <w:tblBorders>
+          <w:top w:val="single" w:sz="4" w:color="A6A6A6"/>
+          <w:left w:val="single" w:sz="4" w:color="A6A6A6"/>
+          <w:bottom w:val="single" w:sz="4" w:color="A6A6A6"/>
+          <w:right w:val="single" w:sz="4" w:color="A6A6A6"/>
+          <w:insideH w:val="single" w:sz="4" w:color="A6A6A6"/>
+          <w:insideV w:val="single" w:sz="4" w:color="A6A6A6"/>
+        </w:tblBorders>
+      </w:tblPr>
+      <w:tblGrid>
+        <w:gridCol w:w="1500"/>
+        <w:gridCol w:w="1100"/>
+        <w:gridCol w:w="1100"/>
+        <w:gridCol w:w="1100"/>
+      </w:tblGrid>
+      <w:tr>
+        <w:trPr>
+          <w:tblHeader w:val="true"/>
+        </w:trPr>
+        <w:tc>
+          <w:tcPr>
+            <w:tcW w:type="dxa" w:w="1500"/>
+            <w:shd w:fill="D9E2F3"/>
+            <w:vAlign w:val="center"/>
+            <w:tcMar>
+              <w:top w:w="50" w:type="dxa"/>
+              <w:start w:w="50" w:type="dxa"/>
+              <w:bottom w:w="50" w:type="dxa"/>
+              <w:end w:w="50" w:type="dxa"/>
+            </w:tcMar>
+          </w:tcPr>
+          <w:p>
+            <w:pPr>
+              <w:spacing w:after="0"/>
+              <w:jc w:val="center"/>
+            </w:pPr>
+            <w:r>
+              <w:rPr>
+                <w:rFonts w:ascii="Times New Roman" w:hAnsi="Times New Roman" w:eastAsia="Times New Roman"/>
+                <w:b/>
+                <w:sz w:val="15"/>
+              </w:rPr>
+              <w:t>Категория</w:t>
+            </w:r>
+          </w:p>
+        </w:tc>
+        <w:tc>
+          <w:tcPr>
+            <w:tcW w:type="dxa" w:w="1100"/>
+            <w:shd w:fill="D9E2F3"/>
+            <w:vAlign w:val="center"/>
+            <w:tcMar>
+              <w:top w:w="50" w:type="dxa"/>
+              <w:start w:w="50" w:type="dxa"/>
+              <w:bottom w:w="50" w:type="dxa"/>
+              <w:end w:w="50" w:type="dxa"/>
+            </w:tcMar>
+          </w:tcPr>
+          <w:p>
+            <w:pPr>
+              <w:spacing w:after="0"/>
+              <w:jc w:val="center"/>
+            </w:pPr>
+            <w:r>
+              <w:rPr>
+                <w:rFonts w:ascii="Times New Roman" w:hAnsi="Times New Roman" w:eastAsia="Times New Roman"/>
+                <w:b/>
+                <w:sz w:val="15"/>
+              </w:rPr>
+              <w:t>BERT LoRA</w:t>
+            </w:r>
+          </w:p>
+        </w:tc>
+        <w:tc>
+          <w:tcPr>
+            <w:tcW w:type="dxa" w:w="1100"/>
+            <w:shd w:fill="D9E2F3"/>
+            <w:vAlign w:val="center"/>
+            <w:tcMar>
+              <w:top w:w="50" w:type="dxa"/>
+              <w:start w:w="50" w:type="dxa"/>
+              <w:bottom w:w="50" w:type="dxa"/>
+              <w:end w:w="50" w:type="dxa"/>
+            </w:tcMar>
+          </w:tcPr>
+          <w:p>
+            <w:pPr>
+              <w:spacing w:after="0"/>
+              <w:jc w:val="center"/>
+            </w:pPr>
+            <w:r>
+              <w:rPr>
+                <w:rFonts w:ascii="Times New Roman" w:hAnsi="Times New Roman" w:eastAsia="Times New Roman"/>
+                <w:b/>
+                <w:sz w:val="15"/>
+              </w:rPr>
+              <w:t>1,1B до</w:t>
+            </w:r>
+          </w:p>
+        </w:tc>
+        <w:tc>
+          <w:tcPr>
+            <w:tcW w:type="dxa" w:w="1100"/>
+            <w:shd w:fill="D9E2F3"/>
+            <w:vAlign w:val="center"/>
+            <w:tcMar>
+              <w:top w:w="50" w:type="dxa"/>
+              <w:start w:w="50" w:type="dxa"/>
+              <w:bottom w:w="50" w:type="dxa"/>
+              <w:end w:w="50" w:type="dxa"/>
+            </w:tcMar>
+          </w:tcPr>
+          <w:p>
+            <w:pPr>
+              <w:spacing w:after="0"/>
+              <w:jc w:val="center"/>
+            </w:pPr>
+            <w:r>
+              <w:rPr>
+                <w:rFonts w:ascii="Times New Roman" w:hAnsi="Times New Roman" w:eastAsia="Times New Roman"/>
+                <w:b/>
+                <w:sz w:val="15"/>
+              </w:rPr>
+              <w:t>1,1B после</w:t>
+            </w:r>
+          </w:p>
+        </w:tc>
+      </w:tr>
+      <w:tr>
+        <w:tc>
+          <w:tcPr>
+            <w:tcW w:type="dxa" w:w="1500"/>
+            <w:vAlign w:val="center"/>
+            <w:tcMar>
+              <w:top w:w="50" w:type="dxa"/>
+              <w:start w:w="50" w:type="dxa"/>
+              <w:bottom w:w="50" w:type="dxa"/>
+              <w:end w:w="50" w:type="dxa"/>
+            </w:tcMar>
+          </w:tcPr>
+          <w:p>
+            <w:pPr>
+              <w:spacing w:after="0" w:line="216" w:lineRule="auto"/>
+              <w:jc w:val="center"/>
+            </w:pPr>
+            <w:r>
+              <w:rPr>
+                <w:rFonts w:ascii="Times New Roman" w:hAnsi="Times New Roman" w:eastAsia="Times New Roman"/>
+                <w:sz w:val="15"/>
+              </w:rPr>
+              <w:t>Chat</w:t>
+            </w:r>
+          </w:p>
+        </w:tc>
+        <w:tc>
+          <w:tcPr>
+            <w:tcW w:type="dxa" w:w="1100"/>
+            <w:vAlign w:val="center"/>
+            <w:tcMar>
+              <w:top w:w="50" w:type="dxa"/>
+              <w:start w:w="50" w:type="dxa"/>
+              <w:bottom w:w="50" w:type="dxa"/>
+              <w:end w:w="50" w:type="dxa"/>
+            </w:tcMar>
+          </w:tcPr>
+          <w:p>
+            <w:pPr>
+              <w:spacing w:after="0" w:line="216" w:lineRule="auto"/>
+              <w:jc w:val="center"/>
+            </w:pPr>
+            <w:r>
+              <w:rPr>
+                <w:rFonts w:ascii="Times New Roman" w:hAnsi="Times New Roman" w:eastAsia="Times New Roman"/>
+                <w:sz w:val="15"/>
+              </w:rPr>
+              <w:t>45.0</w:t>
+            </w:r>
+          </w:p>
+        </w:tc>
+        <w:tc>
+          <w:tcPr>
+            <w:tcW w:type="dxa" w:w="1100"/>
+            <w:vAlign w:val="center"/>
+            <w:tcMar>
+              <w:top w:w="50" w:type="dxa"/>
+              <w:start w:w="50" w:type="dxa"/>
+              <w:bottom w:w="50" w:type="dxa"/>
+              <w:end w:w="50" w:type="dxa"/>
+            </w:tcMar>
+          </w:tcPr>
+          <w:p>
+            <w:pPr>
+              <w:spacing w:after="0" w:line="216" w:lineRule="auto"/>
+              <w:jc w:val="center"/>
+            </w:pPr>
+            <w:r>
+              <w:rPr>
+                <w:rFonts w:ascii="Times New Roman" w:hAnsi="Times New Roman" w:eastAsia="Times New Roman"/>
+                <w:sz w:val="15"/>
+              </w:rPr>
+              <w:t>40.0</w:t>
+            </w:r>
+          </w:p>
+        </w:tc>
+        <w:tc>
+          <w:tcPr>
+            <w:tcW w:type="dxa" w:w="1100"/>
+            <w:vAlign w:val="center"/>
+            <w:tcMar>
+              <w:top w:w="50" w:type="dxa"/>
+              <w:start w:w="50" w:type="dxa"/>
+              <w:bottom w:w="50" w:type="dxa"/>
+              <w:end w:w="50" w:type="dxa"/>
+            </w:tcMar>
+          </w:tcPr>
+          <w:p>
+            <w:pPr>
+              <w:spacing w:after="0" w:line="216" w:lineRule="auto"/>
+              <w:jc w:val="center"/>
+            </w:pPr>
+            <w:r>
+              <w:rPr>
+                <w:rFonts w:ascii="Times New Roman" w:hAnsi="Times New Roman" w:eastAsia="Times New Roman"/>
+                <w:sz w:val="15"/>
+              </w:rPr>
+              <w:t>45.0</w:t>
+            </w:r>
+          </w:p>
+        </w:tc>
+      </w:tr>
+      <w:tr>
+        <w:tc>
+          <w:tcPr>
+            <w:tcW w:type="dxa" w:w="1500"/>
+            <w:vAlign w:val="center"/>
+            <w:tcMar>
+              <w:top w:w="50" w:type="dxa"/>
+              <w:start w:w="50" w:type="dxa"/>
+              <w:bottom w:w="50" w:type="dxa"/>
+              <w:end w:w="50" w:type="dxa"/>
+            </w:tcMar>
+          </w:tcPr>
+          <w:p>
+            <w:pPr>
+              <w:spacing w:after="0" w:line="216" w:lineRule="auto"/>
+              <w:jc w:val="center"/>
+            </w:pPr>
+            <w:r>
+              <w:rPr>
+                <w:rFonts w:ascii="Times New Roman" w:hAnsi="Times New Roman" w:eastAsia="Times New Roman"/>
+                <w:sz w:val="15"/>
+              </w:rPr>
+              <w:t>Chat Hard</w:t>
+            </w:r>
+          </w:p>
+        </w:tc>
+        <w:tc>
+          <w:tcPr>
+            <w:tcW w:type="dxa" w:w="1100"/>
+            <w:vAlign w:val="center"/>
+            <w:tcMar>
+              <w:top w:w="50" w:type="dxa"/>
+              <w:start w:w="50" w:type="dxa"/>
+              <w:bottom w:w="50" w:type="dxa"/>
+              <w:end w:w="50" w:type="dxa"/>
+            </w:tcMar>
+          </w:tcPr>
+          <w:p>
+            <w:pPr>
+              <w:spacing w:after="0" w:line="216" w:lineRule="auto"/>
+              <w:jc w:val="center"/>
+            </w:pPr>
+            <w:r>
+              <w:rPr>
+                <w:rFonts w:ascii="Times New Roman" w:hAnsi="Times New Roman" w:eastAsia="Times New Roman"/>
+                <w:sz w:val="15"/>
+              </w:rPr>
+              <w:t>29.2</w:t>
+            </w:r>
+          </w:p>
+        </w:tc>
+        <w:tc>
+          <w:tcPr>
+            <w:tcW w:type="dxa" w:w="1100"/>
+            <w:vAlign w:val="center"/>
+            <w:tcMar>
+              <w:top w:w="50" w:type="dxa"/>
+              <w:start w:w="50" w:type="dxa"/>
+              <w:bottom w:w="50" w:type="dxa"/>
+              <w:end w:w="50" w:type="dxa"/>
+            </w:tcMar>
+          </w:tcPr>
+          <w:p>
+            <w:pPr>
+              <w:spacing w:after="0" w:line="216" w:lineRule="auto"/>
+              <w:jc w:val="center"/>
+            </w:pPr>
+            <w:r>
+              <w:rPr>
+                <w:rFonts w:ascii="Times New Roman" w:hAnsi="Times New Roman" w:eastAsia="Times New Roman"/>
+                <w:sz w:val="15"/>
+              </w:rPr>
+              <w:t>37.5</w:t>
+            </w:r>
+          </w:p>
+        </w:tc>
+        <w:tc>
+          <w:tcPr>
+            <w:tcW w:type="dxa" w:w="1100"/>
+            <w:vAlign w:val="center"/>
+            <w:tcMar>
+              <w:top w:w="50" w:type="dxa"/>
+              <w:start w:w="50" w:type="dxa"/>
+              <w:bottom w:w="50" w:type="dxa"/>
+              <w:end w:w="50" w:type="dxa"/>
+            </w:tcMar>
+          </w:tcPr>
+          <w:p>
+            <w:pPr>
+              <w:spacing w:after="0" w:line="216" w:lineRule="auto"/>
+              <w:jc w:val="center"/>
+            </w:pPr>
+            <w:r>
+              <w:rPr>
+                <w:rFonts w:ascii="Times New Roman" w:hAnsi="Times New Roman" w:eastAsia="Times New Roman"/>
+                <w:sz w:val="15"/>
+              </w:rPr>
+              <w:t>45.8</w:t>
+            </w:r>
+          </w:p>
+        </w:tc>
+      </w:tr>
+      <w:tr>
+        <w:tc>
+          <w:tcPr>
+            <w:tcW w:type="dxa" w:w="1500"/>
+            <w:vAlign w:val="center"/>
+            <w:tcMar>
+              <w:top w:w="50" w:type="dxa"/>
+              <w:start w:w="50" w:type="dxa"/>
+              <w:bottom w:w="50" w:type="dxa"/>
+              <w:end w:w="50" w:type="dxa"/>
+            </w:tcMar>
+          </w:tcPr>
+          <w:p>
+            <w:pPr>
+              <w:spacing w:after="0" w:line="216" w:lineRule="auto"/>
+              <w:jc w:val="center"/>
+            </w:pPr>
+            <w:r>
+              <w:rPr>
+                <w:rFonts w:ascii="Times New Roman" w:hAnsi="Times New Roman" w:eastAsia="Times New Roman"/>
+                <w:sz w:val="15"/>
+              </w:rPr>
+              <w:t>Safety</w:t>
+            </w:r>
+          </w:p>
+        </w:tc>
+        <w:tc>
+          <w:tcPr>
+            <w:tcW w:type="dxa" w:w="1100"/>
+            <w:vAlign w:val="center"/>
+            <w:tcMar>
+              <w:top w:w="50" w:type="dxa"/>
+              <w:start w:w="50" w:type="dxa"/>
+              <w:bottom w:w="50" w:type="dxa"/>
+              <w:end w:w="50" w:type="dxa"/>
+            </w:tcMar>
+          </w:tcPr>
+          <w:p>
+            <w:pPr>
+              <w:spacing w:after="0" w:line="216" w:lineRule="auto"/>
+              <w:jc w:val="center"/>
+            </w:pPr>
+            <w:r>
+              <w:rPr>
+                <w:rFonts w:ascii="Times New Roman" w:hAnsi="Times New Roman" w:eastAsia="Times New Roman"/>
+                <w:sz w:val="15"/>
+              </w:rPr>
+              <w:t>45.0</w:t>
+            </w:r>
+          </w:p>
+        </w:tc>
+        <w:tc>
+          <w:tcPr>
+            <w:tcW w:type="dxa" w:w="1100"/>
+            <w:vAlign w:val="center"/>
+            <w:tcMar>
+              <w:top w:w="50" w:type="dxa"/>
+              <w:start w:w="50" w:type="dxa"/>
+              <w:bottom w:w="50" w:type="dxa"/>
+              <w:end w:w="50" w:type="dxa"/>
+            </w:tcMar>
+          </w:tcPr>
+          <w:p>
+            <w:pPr>
+              <w:spacing w:after="0" w:line="216" w:lineRule="auto"/>
+              <w:jc w:val="center"/>
+            </w:pPr>
+            <w:r>
+              <w:rPr>
+                <w:rFonts w:ascii="Times New Roman" w:hAnsi="Times New Roman" w:eastAsia="Times New Roman"/>
+                <w:sz w:val="15"/>
+              </w:rPr>
+              <w:t>40.0</w:t>
+            </w:r>
+          </w:p>
+        </w:tc>
+        <w:tc>
+          <w:tcPr>
+            <w:tcW w:type="dxa" w:w="1100"/>
+            <w:vAlign w:val="center"/>
+            <w:tcMar>
+              <w:top w:w="50" w:type="dxa"/>
+              <w:start w:w="50" w:type="dxa"/>
+              <w:bottom w:w="50" w:type="dxa"/>
+              <w:end w:w="50" w:type="dxa"/>
+            </w:tcMar>
+          </w:tcPr>
+          <w:p>
+            <w:pPr>
+              <w:spacing w:after="0" w:line="216" w:lineRule="auto"/>
+              <w:jc w:val="center"/>
+            </w:pPr>
+            <w:r>
+              <w:rPr>
+                <w:rFonts w:ascii="Times New Roman" w:hAnsi="Times New Roman" w:eastAsia="Times New Roman"/>
+                <w:sz w:val="15"/>
+              </w:rPr>
+              <w:t>45.0</w:t>
+            </w:r>
+          </w:p>
+        </w:tc>
+      </w:tr>
+      <w:tr>
+        <w:tc>
+          <w:tcPr>
+            <w:tcW w:type="dxa" w:w="1500"/>
+            <w:vAlign w:val="center"/>
+            <w:tcMar>
+              <w:top w:w="50" w:type="dxa"/>
+              <w:start w:w="50" w:type="dxa"/>
+              <w:bottom w:w="50" w:type="dxa"/>
+              <w:end w:w="50" w:type="dxa"/>
+            </w:tcMar>
+          </w:tcPr>
+          <w:p>
+            <w:pPr>
+              <w:spacing w:after="0" w:line="216" w:lineRule="auto"/>
+              <w:jc w:val="center"/>
+            </w:pPr>
+            <w:r>
+              <w:rPr>
+                <w:rFonts w:ascii="Times New Roman" w:hAnsi="Times New Roman" w:eastAsia="Times New Roman"/>
+                <w:sz w:val="15"/>
+              </w:rPr>
+              <w:t>Reasoning</w:t>
+            </w:r>
+          </w:p>
+        </w:tc>
+        <w:tc>
+          <w:tcPr>
+            <w:tcW w:type="dxa" w:w="1100"/>
+            <w:vAlign w:val="center"/>
+            <w:tcMar>
+              <w:top w:w="50" w:type="dxa"/>
+              <w:start w:w="50" w:type="dxa"/>
+              <w:bottom w:w="50" w:type="dxa"/>
+              <w:end w:w="50" w:type="dxa"/>
+            </w:tcMar>
+          </w:tcPr>
+          <w:p>
+            <w:pPr>
+              <w:spacing w:after="0" w:line="216" w:lineRule="auto"/>
+              <w:jc w:val="center"/>
+            </w:pPr>
+            <w:r>
+              <w:rPr>
+                <w:rFonts w:ascii="Times New Roman" w:hAnsi="Times New Roman" w:eastAsia="Times New Roman"/>
+                <w:sz w:val="15"/>
+              </w:rPr>
+              <w:t>67.9</w:t>
+            </w:r>
+          </w:p>
+        </w:tc>
+        <w:tc>
+          <w:tcPr>
+            <w:tcW w:type="dxa" w:w="1100"/>
+            <w:vAlign w:val="center"/>
+            <w:tcMar>
+              <w:top w:w="50" w:type="dxa"/>
+              <w:start w:w="50" w:type="dxa"/>
+              <w:bottom w:w="50" w:type="dxa"/>
+              <w:end w:w="50" w:type="dxa"/>
+            </w:tcMar>
+          </w:tcPr>
+          <w:p>
+            <w:pPr>
+              <w:spacing w:after="0" w:line="216" w:lineRule="auto"/>
+              <w:jc w:val="center"/>
+            </w:pPr>
+            <w:r>
+              <w:rPr>
+                <w:rFonts w:ascii="Times New Roman" w:hAnsi="Times New Roman" w:eastAsia="Times New Roman"/>
+                <w:sz w:val="15"/>
+              </w:rPr>
+              <w:t>50.0</w:t>
+            </w:r>
+          </w:p>
+        </w:tc>
+        <w:tc>
+          <w:tcPr>
+            <w:tcW w:type="dxa" w:w="1100"/>
+            <w:vAlign w:val="center"/>
+            <w:tcMar>
+              <w:top w:w="50" w:type="dxa"/>
+              <w:start w:w="50" w:type="dxa"/>
+              <w:bottom w:w="50" w:type="dxa"/>
+              <w:end w:w="50" w:type="dxa"/>
+            </w:tcMar>
+          </w:tcPr>
+          <w:p>
+            <w:pPr>
+              <w:spacing w:after="0" w:line="216" w:lineRule="auto"/>
+              <w:jc w:val="center"/>
+            </w:pPr>
+            <w:r>
+              <w:rPr>
+                <w:rFonts w:ascii="Times New Roman" w:hAnsi="Times New Roman" w:eastAsia="Times New Roman"/>
+                <w:sz w:val="15"/>
+              </w:rPr>
+              <w:t>46.4</w:t>
+            </w:r>
+          </w:p>
+        </w:tc>
+      </w:tr>
+      <w:tr>
+        <w:tc>
+          <w:tcPr>
+            <w:tcW w:type="dxa" w:w="1500"/>
+            <w:vAlign w:val="center"/>
+            <w:tcMar>
+              <w:top w:w="50" w:type="dxa"/>
+              <w:start w:w="50" w:type="dxa"/>
+              <w:bottom w:w="50" w:type="dxa"/>
+              <w:end w:w="50" w:type="dxa"/>
+            </w:tcMar>
+          </w:tcPr>
+          <w:p>
+            <w:pPr>
+              <w:spacing w:after="0" w:line="216" w:lineRule="auto"/>
+              <w:jc w:val="center"/>
+            </w:pPr>
+            <w:r>
+              <w:rPr>
+                <w:rFonts w:ascii="Times New Roman" w:hAnsi="Times New Roman" w:eastAsia="Times New Roman"/>
+                <w:sz w:val="15"/>
+              </w:rPr>
+              <w:t>Macro</w:t>
+            </w:r>
+          </w:p>
+        </w:tc>
+        <w:tc>
+          <w:tcPr>
+            <w:tcW w:type="dxa" w:w="1100"/>
+            <w:vAlign w:val="center"/>
+            <w:tcMar>
+              <w:top w:w="50" w:type="dxa"/>
+              <w:start w:w="50" w:type="dxa"/>
+              <w:bottom w:w="50" w:type="dxa"/>
+              <w:end w:w="50" w:type="dxa"/>
+            </w:tcMar>
+          </w:tcPr>
+          <w:p>
+            <w:pPr>
+              <w:spacing w:after="0" w:line="216" w:lineRule="auto"/>
+              <w:jc w:val="center"/>
+            </w:pPr>
+            <w:r>
+              <w:rPr>
+                <w:rFonts w:ascii="Times New Roman" w:hAnsi="Times New Roman" w:eastAsia="Times New Roman"/>
+                <w:sz w:val="15"/>
+              </w:rPr>
+              <w:t>46.8</w:t>
+            </w:r>
+          </w:p>
+        </w:tc>
+        <w:tc>
+          <w:tcPr>
+            <w:tcW w:type="dxa" w:w="1100"/>
+            <w:vAlign w:val="center"/>
+            <w:tcMar>
+              <w:top w:w="50" w:type="dxa"/>
+              <w:start w:w="50" w:type="dxa"/>
+              <w:bottom w:w="50" w:type="dxa"/>
+              <w:end w:w="50" w:type="dxa"/>
+            </w:tcMar>
+          </w:tcPr>
+          <w:p>
+            <w:pPr>
+              <w:spacing w:after="0" w:line="216" w:lineRule="auto"/>
+              <w:jc w:val="center"/>
+            </w:pPr>
+            <w:r>
+              <w:rPr>
+                <w:rFonts w:ascii="Times New Roman" w:hAnsi="Times New Roman" w:eastAsia="Times New Roman"/>
+                <w:sz w:val="15"/>
+              </w:rPr>
+              <w:t>41.9</w:t>
+            </w:r>
+          </w:p>
+        </w:tc>
+        <w:tc>
+          <w:tcPr>
+            <w:tcW w:type="dxa" w:w="1100"/>
+            <w:vAlign w:val="center"/>
+            <w:tcMar>
+              <w:top w:w="50" w:type="dxa"/>
+              <w:start w:w="50" w:type="dxa"/>
+              <w:bottom w:w="50" w:type="dxa"/>
+              <w:end w:w="50" w:type="dxa"/>
+            </w:tcMar>
+          </w:tcPr>
+          <w:p>
+            <w:pPr>
+              <w:spacing w:after="0" w:line="216" w:lineRule="auto"/>
+              <w:jc w:val="center"/>
+            </w:pPr>
+            <w:r>
+              <w:rPr>
+                <w:rFonts w:ascii="Times New Roman" w:hAnsi="Times New Roman" w:eastAsia="Times New Roman"/>
+                <w:sz w:val="15"/>
+              </w:rPr>
+              <w:t>45.6</w:t>
+            </w:r>
+          </w:p>
+        </w:tc>
+      </w:tr>
+      <w:tr>
+        <w:tc>
+          <w:tcPr>
+            <w:tcW w:type="dxa" w:w="1500"/>
+            <w:vAlign w:val="center"/>
+            <w:tcMar>
+              <w:top w:w="50" w:type="dxa"/>
+              <w:start w:w="50" w:type="dxa"/>
+              <w:bottom w:w="50" w:type="dxa"/>
+              <w:end w:w="50" w:type="dxa"/>
+            </w:tcMar>
+          </w:tcPr>
+          <w:p>
+            <w:pPr>
+              <w:spacing w:after="0" w:line="216" w:lineRule="auto"/>
+              <w:jc w:val="center"/>
+            </w:pPr>
+            <w:r>
+              <w:rPr>
+                <w:rFonts w:ascii="Times New Roman" w:hAnsi="Times New Roman" w:eastAsia="Times New Roman"/>
+                <w:sz w:val="15"/>
+              </w:rPr>
+              <w:t>Micro</w:t>
+            </w:r>
+          </w:p>
+        </w:tc>
+        <w:tc>
+          <w:tcPr>
+            <w:tcW w:type="dxa" w:w="1100"/>
+            <w:vAlign w:val="center"/>
+            <w:tcMar>
+              <w:top w:w="50" w:type="dxa"/>
+              <w:start w:w="50" w:type="dxa"/>
+              <w:bottom w:w="50" w:type="dxa"/>
+              <w:end w:w="50" w:type="dxa"/>
+            </w:tcMar>
+          </w:tcPr>
+          <w:p>
+            <w:pPr>
+              <w:spacing w:after="0" w:line="216" w:lineRule="auto"/>
+              <w:jc w:val="center"/>
+            </w:pPr>
+            <w:r>
+              <w:rPr>
+                <w:rFonts w:ascii="Times New Roman" w:hAnsi="Times New Roman" w:eastAsia="Times New Roman"/>
+                <w:sz w:val="15"/>
+              </w:rPr>
+              <w:t>47.8</w:t>
+            </w:r>
+          </w:p>
+        </w:tc>
+        <w:tc>
+          <w:tcPr>
+            <w:tcW w:type="dxa" w:w="1100"/>
+            <w:vAlign w:val="center"/>
+            <w:tcMar>
+              <w:top w:w="50" w:type="dxa"/>
+              <w:start w:w="50" w:type="dxa"/>
+              <w:bottom w:w="50" w:type="dxa"/>
+              <w:end w:w="50" w:type="dxa"/>
+            </w:tcMar>
+          </w:tcPr>
+          <w:p>
+            <w:pPr>
+              <w:spacing w:after="0" w:line="216" w:lineRule="auto"/>
+              <w:jc w:val="center"/>
+            </w:pPr>
+            <w:r>
+              <w:rPr>
+                <w:rFonts w:ascii="Times New Roman" w:hAnsi="Times New Roman" w:eastAsia="Times New Roman"/>
+                <w:sz w:val="15"/>
+              </w:rPr>
+              <w:t>42.4</w:t>
+            </w:r>
+          </w:p>
+        </w:tc>
+        <w:tc>
+          <w:tcPr>
+            <w:tcW w:type="dxa" w:w="1100"/>
+            <w:vAlign w:val="center"/>
+            <w:tcMar>
+              <w:top w:w="50" w:type="dxa"/>
+              <w:start w:w="50" w:type="dxa"/>
+              <w:bottom w:w="50" w:type="dxa"/>
+              <w:end w:w="50" w:type="dxa"/>
+            </w:tcMar>
+          </w:tcPr>
+          <w:p>
+            <w:pPr>
+              <w:spacing w:after="0" w:line="216" w:lineRule="auto"/>
+              <w:jc w:val="center"/>
+            </w:pPr>
+            <w:r>
+              <w:rPr>
+                <w:rFonts w:ascii="Times New Roman" w:hAnsi="Times New Roman" w:eastAsia="Times New Roman"/>
+                <w:sz w:val="15"/>
+              </w:rPr>
+              <w:t>45.7</w:t>
+            </w:r>
+          </w:p>
+        </w:tc>
+      </w:tr>
+    </w:tbl>
     <w:p>
       <w:pPr>
         <w:pStyle w:val="a3"/>
@@ -4119,7 +4903,21 @@
           <w:rFonts w:ascii="Times New Roman" w:hAnsi="Times New Roman" w:eastAsia="Times New Roman"/>
           <w:sz w:val="20"/>
         </w:rPr>
-        <w:t>Наблюдаемая связь между углом и ESS согласуется с теоретическим механизмом: увеличение β подавляет вклад пар с положительным отступом и концентрирует обновление на трудных или ошибочных примерах. При малом β веса почти равны, но направление также отличается от β=1, поскольку опорная модель уже создаёт неоднородные отступы. Симметрия углов относительно β=1 не ожидается: логистическое перевзвешивание нелинейно.</w:t>
+        <w:t>После 24 LoRA-шагов micro accuracy TinyLlama на 92 внешних примерах изменилась с 42,39% до 45,65% (+3,26 п.п.): улучшились 8 примеров, ухудшились 5, без изменения остались 79. Однако 95%-й bootstrap-интервал парного изменения равен −4,35…10,87 п.п., а двусторонний exact sign test даёт p=0,581. На 48 отложенных HH-парах точность снизилась с 47,92% до 45,83%. По категориям выросли Chat, Chat Hard и Safety, но Reasoning снизилась с 50,0% до 46,4%. Следовательно, пилот демонстрирует воспроизводимый протокол переноса, но не статистически подтверждённое преимущество.</w:t>
+      </w:r>
+    </w:p>
+    <w:p>
+      <w:pPr>
+        <w:pStyle w:val="1"/>
+        <w:keepNext/>
+      </w:pPr>
+      <w:r>
+        <w:rPr>
+          <w:rFonts w:ascii="Times New Roman" w:hAnsi="Times New Roman" w:eastAsia="Times New Roman"/>
+          <w:i w:val="0"/>
+          <w:sz w:val="20"/>
+        </w:rPr>
+        <w:t>ОБСУЖДЕНИЕ</w:t>
       </w:r>
     </w:p>
     <w:p>
@@ -4132,7 +4930,7 @@
           <w:rFonts w:ascii="Times New Roman" w:hAnsi="Times New Roman" w:eastAsia="Times New Roman"/>
           <w:sz w:val="20"/>
         </w:rPr>
-        <w:t>Сравнение потерь показывает, что различие между разностной и абсолютной идентификацией сохраняется на реальных парах. LoRA-эксперимент переносит анализ с фиксированных признаков на внутренние представления Transformer, но отсутствие среднего прироста accuracy ограничивает практический вывод. Результат согласуется с идеей KTO о зависимости подходящей функции потерь от предположений о человеческой полезности [20]: параметризация адаптера сама по себе не устраняет несоответствие малой выборки и целевой метрики.</w:t>
+        <w:t>Наблюдаемая связь между углом и ESS согласуется с теоретическим механизмом: увеличение β подавляет вклад пар с положительным отступом и концентрирует обновление на трудных или ошибочных примерах. При малом β веса почти равны, но направление также отличается от β=1, поскольку опорная модель уже создаёт неоднородные отступы. Симметрия углов относительно β=1 не ожидается: логистическое перевзвешивание нелинейно.</w:t>
       </w:r>
     </w:p>
     <w:p>
@@ -4145,7 +4943,33 @@
           <w:rFonts w:ascii="Times New Roman" w:hAnsi="Times New Roman" w:eastAsia="Times New Roman"/>
           <w:sz w:val="20"/>
         </w:rPr>
-        <w:t>К ограничениям относятся один англоязычный датасет, компактный BERT вместо генеративной LLM, три нейросетевых seed, один ранг и отсутствие внешней оценки RewardBench. Дальнейшая работа должна сравнить LoRA, LoRA+ и PiSSA на моделях 1–7 млрд параметров, включить несколько β в обучение, логировать послойные углы и проверять перенос на RewardBench. Для русскоязычного переноса нужен сопоставимый корпус пар и контроль длины ответа.</w:t>
+        <w:t>Сравнение потерь показывает, что различие между разностной и абсолютной идентификацией сохраняется на реальных парах. LoRA-эксперимент переносит анализ с фиксированных признаков на внутренние представления Transformer, но отсутствие среднего прироста accuracy ограничивает практический вывод. Результат согласуется с идеей KTO о зависимости подходящей функции потерь от предположений о человеческой полезности [20]: параметризация адаптера сама по себе не устраняет несоответствие малой выборки и целевой метрики.</w:t>
+      </w:r>
+    </w:p>
+    <w:p>
+      <w:pPr>
+        <w:pStyle w:val="a3"/>
+        <w:keepLines w:val="0"/>
+      </w:pPr>
+      <w:r>
+        <w:rPr>
+          <w:rFonts w:ascii="Times New Roman" w:hAnsi="Times New Roman" w:eastAsia="Times New Roman"/>
+          <w:sz w:val="20"/>
+        </w:rPr>
+        <w:t>Секторное применение требует оценивать именно критический тип ошибки. Для поддержки и электронной торговли это фактическая полезность и ошибочная эскалация; для финансов — комплаенс и конфиденциальность; для образования — правильность рассуждения; для здравоохранения и промышленности — безопасный отказ и обязательный контроль специалиста; для государства — трассируемость, равное обращение и защита данных. Разнонаправленный результат RewardBench показывает, почему средний балл нельзя использовать как единственный допуск к эксплуатации.</w:t>
+      </w:r>
+    </w:p>
+    <w:p>
+      <w:pPr>
+        <w:pStyle w:val="a3"/>
+        <w:keepLines w:val="0"/>
+      </w:pPr>
+      <w:r>
+        <w:rPr>
+          <w:rFonts w:ascii="Times New Roman" w:hAnsi="Times New Roman" w:eastAsia="Times New Roman"/>
+          <w:sz w:val="20"/>
+        </w:rPr>
+        <w:t>Ограничения: один англоязычный обучающий набор; только три BERT-seed; один seed, 24 пары и короткие последовательности в CPU-пилоте 1,1B; 92 внешних примера вместо полного RewardBench; отсутствие отраслевой разметки. Дальнейшая работа должна выполнить полный benchmark, увеличить число seed и пар, сравнить LoRA/LoRA+/PiSSA на 1–3B моделях, добавить M-RewardBench и русскоязычный корпус, а также предварительно зарегистрировать критерии успеха по каждой категории.</w:t>
       </w:r>
     </w:p>
     <w:p>
@@ -4172,7 +4996,7 @@
           <w:rFonts w:ascii="Times New Roman" w:hAnsi="Times New Roman" w:eastAsia="Times New Roman"/>
           <w:sz w:val="20"/>
         </w:rPr>
-        <w:t>Эксперимент на реальных данных HH-RLHF подтвердил три вывода. Во-первых, β является геометрическим гиперпараметром: в линейной модели он повернул градиент до 34,71°. Во-вторых, этот механизм сохранился в пространстве LoRA: при β=10 угол достиг 30,39°, ESS/n уменьшился до 0,6199. В-третьих, обучение 0,189% параметров не гарантировало прироста точности на 1400 парах; ранняя остановка выбирала первую эпоху всех LoRA-запусков. Практически β, функцию потерь и параметризацию адаптера следует выбирать совместно и контролировать через угол градиента, ESS, насыщение весов и внешнюю валидацию.</w:t>
+        <w:t>Эксперимент подтвердил, что β является геометрическим гиперпараметром: угол достиг 34,71° в линейной модели и 30,39° в пространстве LoRA. Адаптация BERT-tiny не дала среднего преимущества, а CPU-пилот TinyLlama 1,1B изменил внешнюю micro accuracy на +3,26 п.п. без статистической значимости и ухудшил отложенную HH-точность. Поэтому масштаб модели и малая доля обучаемых параметров не заменяют внешнюю проверку. Для практики β, функцию потерь, LoRA-конфигурацию и отраслевой критерий допуска следует выбирать совместно, сохраняя категориальные метрики и human-in-the-loop контроль.</w:t>
       </w:r>
     </w:p>
     <w:p>
@@ -4474,6 +5298,58 @@
           <w:sz w:val="16"/>
         </w:rPr>
         <w:t>K. Ethayarajh, W. Xu, N. Muennighoff, D. Jurafsky, and D. Kiela, “Model alignment as prospect theoretic optimization,” in Proc. 41st Int. Conf. Machine Learning, PMLR 235, 2024, pp. 12634–12651.</w:t>
+      </w:r>
+    </w:p>
+    <w:p>
+      <w:pPr>
+        <w:pStyle w:val="references"/>
+        <w:keepLines/>
+      </w:pPr>
+      <w:r>
+        <w:rPr>
+          <w:rFonts w:ascii="Times New Roman" w:hAnsi="Times New Roman" w:eastAsia="Times New Roman"/>
+          <w:sz w:val="16"/>
+        </w:rPr>
+        <w:t>P. Zhang, G. Zeng, T. Wang, and W. Lu, “TinyLlama: An open-source small language model,” arXiv:2401.02385, 2024.</w:t>
+      </w:r>
+    </w:p>
+    <w:p>
+      <w:pPr>
+        <w:pStyle w:val="references"/>
+        <w:keepLines/>
+      </w:pPr>
+      <w:r>
+        <w:rPr>
+          <w:rFonts w:ascii="Times New Roman" w:hAnsi="Times New Roman" w:eastAsia="Times New Roman"/>
+          <w:sz w:val="16"/>
+        </w:rPr>
+        <w:t>C. Autio et al., Artificial Intelligence Risk Management Framework: Generative Artificial Intelligence Profile, NIST AI 600-1, 2024, doi: 10.6028/NIST.AI.600-1.</w:t>
+      </w:r>
+    </w:p>
+    <w:p>
+      <w:pPr>
+        <w:pStyle w:val="references"/>
+        <w:keepLines/>
+      </w:pPr>
+      <w:r>
+        <w:rPr>
+          <w:rFonts w:ascii="Times New Roman" w:hAnsi="Times New Roman" w:eastAsia="Times New Roman"/>
+          <w:sz w:val="16"/>
+        </w:rPr>
+        <w:t>OECD, Governing with Artificial Intelligence: The State of Play and Way Forward in Core Government Functions. Paris, France: OECD Publishing, 2025, doi: 10.1787/795de142-en.</w:t>
+      </w:r>
+    </w:p>
+    <w:p>
+      <w:pPr>
+        <w:pStyle w:val="references"/>
+        <w:keepLines/>
+      </w:pPr>
+      <w:r>
+        <w:rPr>
+          <w:rFonts w:ascii="Times New Roman" w:hAnsi="Times New Roman" w:eastAsia="Times New Roman"/>
+          <w:sz w:val="16"/>
+        </w:rPr>
+        <w:t>OECD, Generative AI and the SME Workforce. Paris, France: OECD Publishing, 2025.</w:t>
       </w:r>
     </w:p>
     <w:p>

</xml_diff>